<commit_message>
fix(S4): reordenar slides 5-8 — Chamberlin→D-S→Krugman bio→aplicación
Flujo cronológico: tríada (anomalía) → Chamberlin 1933 → Dixit-Stiglitz
1977 → Krugman bio → Krugman 1979 aplica D-S al comercio.
Regenerado HTML y notas docente Word.

Co-Authored-By: Claude Opus 4.6 (1M context) <noreply@anthropic.com>
</commit_message>
<xml_diff>
--- a/Clases/sesion04/Notas_Docente_Clase4.docx
+++ b/Clases/sesion04/Notas_Docente_Clase4.docx
@@ -118,7 +118,7 @@
         <w:rPr>
           <w:sz w:val="18"/>
         </w:rPr>
-        <w:t xml:space="preserve">   S5: Paul Krugman — El arquitecto de la Nueva Teoría del Comercio</w:t>
+        <w:t xml:space="preserve">   S5: Edward Chamberlin y la competencia monopolística (1933)</w:t>
       </w:r>
     </w:p>
     <w:p>
@@ -129,7 +129,7 @@
         <w:rPr>
           <w:sz w:val="18"/>
         </w:rPr>
-        <w:t xml:space="preserve">   S6: Competencia monopolística — la estructura de mercado que necesitamos</w:t>
+        <w:t xml:space="preserve">   S6: Dixit-Stiglitz (1977) — Formalizar el amor por la variedad</w:t>
       </w:r>
     </w:p>
     <w:p>
@@ -152,7 +152,7 @@
         <w:rPr>
           <w:sz w:val="18"/>
         </w:rPr>
-        <w:t xml:space="preserve">   S7: El modelo de Krugman — Rendimientos crecientes, diferenciación y comercio intraindustrial</w:t>
+        <w:t xml:space="preserve">   S7: Paul Krugman — El arquitecto de la Nueva Teoría del Comercio</w:t>
       </w:r>
     </w:p>
     <w:p>
@@ -163,7 +163,7 @@
         <w:rPr>
           <w:sz w:val="18"/>
         </w:rPr>
-        <w:t xml:space="preserve">   S8: Rendimientos crecientes: la intuición clave</w:t>
+        <w:t xml:space="preserve">   S8: Krugman (1979) — De Dixit-Stiglitz al comercio internacional</w:t>
       </w:r>
     </w:p>
     <w:p>
@@ -174,7 +174,7 @@
         <w:rPr>
           <w:sz w:val="18"/>
         </w:rPr>
-        <w:t xml:space="preserve">   S9: Economías de escala internas vs externas</w:t>
+        <w:t xml:space="preserve">   S9: El modelo de Krugman — Rendimientos crecientes, diferenciación y comercio intraindustrial</w:t>
       </w:r>
     </w:p>
     <w:p>
@@ -185,7 +185,7 @@
         <w:rPr>
           <w:sz w:val="18"/>
         </w:rPr>
-        <w:t xml:space="preserve">   S10: Escala y especialización sin ventaja comparativa</w:t>
+        <w:t xml:space="preserve">   S10: Rendimientos crecientes: la intuición clave</w:t>
       </w:r>
     </w:p>
     <w:p>
@@ -196,7 +196,7 @@
         <w:rPr>
           <w:sz w:val="18"/>
         </w:rPr>
-        <w:t xml:space="preserve">   S11: Comercio intraindustrial: el hecho a explicar</w:t>
+        <w:t xml:space="preserve">   S11: Economías de escala internas vs externas</w:t>
       </w:r>
     </w:p>
     <w:p>
@@ -207,7 +207,7 @@
         <w:rPr>
           <w:sz w:val="18"/>
         </w:rPr>
-        <w:t xml:space="preserve">   S12: El mecanismo Krugman en 4 pasos</w:t>
+        <w:t xml:space="preserve">   S12: Escala y especialización sin ventaja comparativa</w:t>
       </w:r>
     </w:p>
     <w:p>
@@ -218,7 +218,7 @@
         <w:rPr>
           <w:sz w:val="18"/>
         </w:rPr>
-        <w:t xml:space="preserve">   S13: Ganancias del comercio: variedad y escala</w:t>
+        <w:t xml:space="preserve">   S13: Comercio intraindustrial: el hecho a explicar</w:t>
       </w:r>
     </w:p>
     <w:p>
@@ -229,7 +229,29 @@
         <w:rPr>
           <w:sz w:val="18"/>
         </w:rPr>
-        <w:t xml:space="preserve">   S14: Tabla comparativa de teorías</w:t>
+        <w:t xml:space="preserve">   S14: El mecanismo Krugman en 4 pasos</w:t>
+      </w:r>
+    </w:p>
+    <w:p>
+      <w:pPr>
+        <w:spacing w:before="0" w:after="0"/>
+      </w:pPr>
+      <w:r>
+        <w:rPr>
+          <w:sz w:val="18"/>
+        </w:rPr>
+        <w:t xml:space="preserve">   S15: Ganancias del comercio: variedad y escala</w:t>
+      </w:r>
+    </w:p>
+    <w:p>
+      <w:pPr>
+        <w:spacing w:before="0" w:after="0"/>
+      </w:pPr>
+      <w:r>
+        <w:rPr>
+          <w:sz w:val="18"/>
+        </w:rPr>
+        <w:t xml:space="preserve">   S16: Tabla comparativa de teorías</w:t>
       </w:r>
     </w:p>
     <w:p>
@@ -252,7 +274,7 @@
         <w:rPr>
           <w:sz w:val="18"/>
         </w:rPr>
-        <w:t xml:space="preserve">   S15: Medir el comercio intraindustrial — Grubel-Lloyd, evidencia comparada y el caso argentino</w:t>
+        <w:t xml:space="preserve">   S17: Medir el comercio intraindustrial — Grubel-Lloyd, evidencia comparada y el caso argentino</w:t>
       </w:r>
     </w:p>
     <w:p>
@@ -263,7 +285,7 @@
         <w:rPr>
           <w:sz w:val="18"/>
         </w:rPr>
-        <w:t xml:space="preserve">   S16: ¿Qué vieron Grubel y Lloyd?</w:t>
+        <w:t xml:space="preserve">   S18: ¿Qué vieron Grubel y Lloyd?</w:t>
       </w:r>
     </w:p>
     <w:p>
@@ -274,7 +296,7 @@
         <w:rPr>
           <w:sz w:val="18"/>
         </w:rPr>
-        <w:t xml:space="preserve">   S17: Índice de Grubel-Lloyd</w:t>
+        <w:t xml:space="preserve">   S19: Índice de Grubel-Lloyd</w:t>
       </w:r>
     </w:p>
     <w:p>
@@ -285,7 +307,7 @@
         <w:rPr>
           <w:sz w:val="18"/>
         </w:rPr>
-        <w:t xml:space="preserve">   S18: IIT horizontal vs vertical</w:t>
+        <w:t xml:space="preserve">   S20: IIT horizontal vs vertical</w:t>
       </w:r>
     </w:p>
     <w:p>
@@ -296,7 +318,7 @@
         <w:rPr>
           <w:sz w:val="18"/>
         </w:rPr>
-        <w:t xml:space="preserve">   S19: Evidencia comparada: ¿dónde hay más IIT?</w:t>
+        <w:t xml:space="preserve">   S21: Evidencia comparada: ¿dónde hay más IIT?</w:t>
       </w:r>
     </w:p>
     <w:p>
@@ -307,7 +329,7 @@
         <w:rPr>
           <w:sz w:val="18"/>
         </w:rPr>
-        <w:t xml:space="preserve">   S20: Caso Mercosur autos: Krugman en acción</w:t>
+        <w:t xml:space="preserve">   S22: Caso Mercosur autos: Krugman en acción</w:t>
       </w:r>
     </w:p>
     <w:p>
@@ -318,7 +340,7 @@
         <w:rPr>
           <w:sz w:val="18"/>
         </w:rPr>
-        <w:t xml:space="preserve">   S21: Argentina y el comercio intraindustrial: ¿excepción o patrón?</w:t>
+        <w:t xml:space="preserve">   S23: Argentina y el comercio intraindustrial: ¿excepción o patrón?</w:t>
       </w:r>
     </w:p>
     <w:p>
@@ -341,7 +363,7 @@
         <w:rPr>
           <w:sz w:val="18"/>
         </w:rPr>
-        <w:t xml:space="preserve">   S22: Implicancias — Ganadores, perdedores y el tamaño del mercado</w:t>
+        <w:t xml:space="preserve">   S24: Implicancias — Ganadores, perdedores y el tamaño del mercado</w:t>
       </w:r>
     </w:p>
     <w:p>
@@ -352,7 +374,7 @@
         <w:rPr>
           <w:sz w:val="18"/>
         </w:rPr>
-        <w:t xml:space="preserve">   S23: ¿Quién gana y quién pierde?</w:t>
+        <w:t xml:space="preserve">   S25: ¿Quién gana y quién pierde?</w:t>
       </w:r>
     </w:p>
     <w:p>
@@ -363,7 +385,7 @@
         <w:rPr>
           <w:sz w:val="18"/>
         </w:rPr>
-        <w:t xml:space="preserve">   S24: El efecto home-market y el mercado efectivo</w:t>
+        <w:t xml:space="preserve">   S26: El efecto home-market y el mercado efectivo</w:t>
       </w:r>
     </w:p>
     <w:p>
@@ -374,7 +396,7 @@
         <w:rPr>
           <w:sz w:val="18"/>
         </w:rPr>
-        <w:t xml:space="preserve">   S25: Nueva Geografía Económica: centro-periferia</w:t>
+        <w:t xml:space="preserve">   S27: Nueva Geografía Económica: centro-periferia</w:t>
       </w:r>
     </w:p>
     <w:p>
@@ -385,7 +407,7 @@
         <w:rPr>
           <w:sz w:val="18"/>
         </w:rPr>
-        <w:t xml:space="preserve">   S26: Implicancias de política</w:t>
+        <w:t xml:space="preserve">   S28: Implicancias de política</w:t>
       </w:r>
     </w:p>
     <w:p>
@@ -396,7 +418,7 @@
         <w:rPr>
           <w:sz w:val="18"/>
         </w:rPr>
-        <w:t xml:space="preserve">   S27: ¿Cuándo aplica mejor esta teoría?</w:t>
+        <w:t xml:space="preserve">   S29: ¿Cuándo aplica mejor esta teoría?</w:t>
       </w:r>
     </w:p>
     <w:p>
@@ -419,7 +441,7 @@
         <w:rPr>
           <w:sz w:val="18"/>
         </w:rPr>
-        <w:t xml:space="preserve">   S28: Nueva Geografía Económica — ¿Por qué la producción se concentra en ciertos lugares?</w:t>
+        <w:t xml:space="preserve">   S30: Nueva Geografía Económica — ¿Por qué la producción se concentra en ciertos lugares?</w:t>
       </w:r>
     </w:p>
     <w:p>
@@ -430,7 +452,7 @@
         <w:rPr>
           <w:sz w:val="18"/>
         </w:rPr>
-        <w:t xml:space="preserve">   S29: Fuerzas centrípetas vs centrífugas</w:t>
+        <w:t xml:space="preserve">   S31: Fuerzas centrípetas vs centrífugas</w:t>
       </w:r>
     </w:p>
     <w:p>
@@ -441,7 +463,7 @@
         <w:rPr>
           <w:sz w:val="18"/>
         </w:rPr>
-        <w:t xml:space="preserve">   S30: El modelo centro-periferia de Krugman (1991)</w:t>
+        <w:t xml:space="preserve">   S32: El modelo centro-periferia de Krugman (1991)</w:t>
       </w:r>
     </w:p>
     <w:p>
@@ -452,7 +474,7 @@
         <w:rPr>
           <w:sz w:val="18"/>
         </w:rPr>
-        <w:t xml:space="preserve">   S31: Evidencia empírica de la NGE</w:t>
+        <w:t xml:space="preserve">   S33: Evidencia empírica de la NGE</w:t>
       </w:r>
     </w:p>
     <w:p>
@@ -463,7 +485,7 @@
         <w:rPr>
           <w:sz w:val="18"/>
         </w:rPr>
-        <w:t xml:space="preserve">   S32: NGE y Argentina: la concentración territorial</w:t>
+        <w:t xml:space="preserve">   S34: NGE y Argentina: la concentración territorial</w:t>
       </w:r>
     </w:p>
     <w:p>
@@ -486,7 +508,7 @@
         <w:rPr>
           <w:sz w:val="18"/>
         </w:rPr>
-        <w:t xml:space="preserve">   S33: Resumen de la clase</w:t>
+        <w:t xml:space="preserve">   S35: Resumen de la clase</w:t>
       </w:r>
     </w:p>
     <w:p>
@@ -497,7 +519,7 @@
         <w:rPr>
           <w:sz w:val="18"/>
         </w:rPr>
-        <w:t xml:space="preserve">   S34: Material complementario</w:t>
+        <w:t xml:space="preserve">   S36: Material complementario</w:t>
       </w:r>
     </w:p>
     <w:p>
@@ -508,7 +530,7 @@
         <w:rPr>
           <w:sz w:val="18"/>
         </w:rPr>
-        <w:t xml:space="preserve">   S35: Lecturas</w:t>
+        <w:t xml:space="preserve">   S37: Lecturas</w:t>
       </w:r>
     </w:p>
     <w:p>
@@ -519,7 +541,7 @@
         <w:rPr>
           <w:sz w:val="18"/>
         </w:rPr>
-        <w:t xml:space="preserve">   S36: Guía de lectura — Preguntas orientadoras para la bibliografía</w:t>
+        <w:t xml:space="preserve">   S38: Guía de lectura — Preguntas orientadoras para la bibliografía</w:t>
       </w:r>
     </w:p>
     <w:p>
@@ -530,7 +552,7 @@
         <w:rPr>
           <w:sz w:val="18"/>
         </w:rPr>
-        <w:t xml:space="preserve">   S37: Próxima clase</w:t>
+        <w:t xml:space="preserve">   S39: Próxima clase</w:t>
       </w:r>
     </w:p>
     <w:p>
@@ -1050,134 +1072,144 @@
           <w:b/>
           <w:sz w:val="20"/>
         </w:rPr>
-        <w:t xml:space="preserve"> S5  Paul Krugman — El arquitecto de la Nueva Teoría del Comercio</w:t>
-      </w:r>
-    </w:p>
-    <w:p>
-      <w:pPr>
-        <w:spacing w:before="0" w:after="20"/>
-      </w:pPr>
-      <w:r>
-        <w:rPr>
-          <w:sz w:val="20"/>
-        </w:rPr>
-        <w:t>BIOGRAFÍA KRUGMAN (5 minutos)</w:t>
-      </w:r>
-    </w:p>
-    <w:p>
-      <w:pPr>
-        <w:spacing w:before="0" w:after="20"/>
-      </w:pPr>
-      <w:r>
-        <w:rPr>
-          <w:sz w:val="20"/>
-        </w:rPr>
-        <w:t>Paul Krugman nació en 1953, estudió en Yale y MIT. Su contribución clave fue formalizar algo que los economistas intuían pero no podían modelar: que gran parte del comercio entre países desarrollados no se explicaba por diferencias en dotaciones sino por economías de escala y diferenciación de productos.</w:t>
-      </w:r>
-    </w:p>
-    <w:p>
-      <w:pPr>
-        <w:spacing w:before="0" w:after="20"/>
-      </w:pPr>
-      <w:r>
-        <w:rPr>
-          <w:sz w:val="20"/>
-        </w:rPr>
-      </w:r>
-    </w:p>
-    <w:p>
-      <w:pPr>
-        <w:spacing w:before="0" w:after="20"/>
-      </w:pPr>
-      <w:r>
-        <w:rPr>
-          <w:sz w:val="20"/>
-        </w:rPr>
-        <w:t>CONTEXTO HISTÓRICO: En los años 70-80, la evidencia mostraba que el comercio entre países ricos (la tríada que acabamos de ver) crecía explosivamente, y era mayormente intraindustrial. Los modelos de competencia perfecta no podían explicar esto. Krugman tomó herramientas de la teoría de organización industrial (competencia monopolística de Dixit-Stiglitz) y las aplicó al comercio internacional.</w:t>
-      </w:r>
-    </w:p>
-    <w:p>
-      <w:pPr>
-        <w:spacing w:before="0" w:after="20"/>
-      </w:pPr>
-      <w:r>
-        <w:rPr>
-          <w:sz w:val="20"/>
-        </w:rPr>
-      </w:r>
-    </w:p>
-    <w:p>
-      <w:pPr>
-        <w:spacing w:before="0" w:after="20"/>
-      </w:pPr>
-      <w:r>
-        <w:rPr>
-          <w:sz w:val="20"/>
-        </w:rPr>
-        <w:t>¿CON QUIÉN DISCUTE? Con el "núcleo" de la teoría tradicional: Ricardo y H-O asumen rendimientos constantes y competencia perfecta. Krugman introduce rendimientos crecientes y competencia imperfecta como motor del comercio.</w:t>
-      </w:r>
-    </w:p>
-    <w:p>
-      <w:pPr>
-        <w:spacing w:before="0" w:after="20"/>
-      </w:pPr>
-      <w:r>
-        <w:rPr>
-          <w:sz w:val="20"/>
-        </w:rPr>
-      </w:r>
-    </w:p>
-    <w:p>
-      <w:pPr>
-        <w:spacing w:before="0" w:after="20"/>
-      </w:pPr>
-      <w:r>
-        <w:rPr>
-          <w:sz w:val="20"/>
-        </w:rPr>
-        <w:t>ANÉCDOTA: El propio Krugman cuenta que la idea le vino al notar que el comercio EEUU-Canadá en manufacturas similares era enorme, algo que H-O no podía explicar bien.</w:t>
-      </w:r>
-    </w:p>
-    <w:p>
-      <w:pPr>
-        <w:spacing w:before="0" w:after="20"/>
-      </w:pPr>
-      <w:r>
-        <w:rPr>
-          <w:sz w:val="20"/>
-        </w:rPr>
-      </w:r>
-    </w:p>
-    <w:p>
-      <w:pPr>
-        <w:spacing w:before="0" w:after="20"/>
-      </w:pPr>
-      <w:r>
-        <w:rPr>
-          <w:sz w:val="20"/>
-        </w:rPr>
-        <w:t>CITA: "Las economías de escala internas son, en la práctica, la fuerza principal detrás del comercio intraindustrial."</w:t>
-      </w:r>
-    </w:p>
-    <w:p>
-      <w:pPr>
-        <w:spacing w:before="0" w:after="20"/>
-      </w:pPr>
-      <w:r>
-        <w:rPr>
-          <w:sz w:val="20"/>
-        </w:rPr>
-      </w:r>
-    </w:p>
-    <w:p>
-      <w:pPr>
-        <w:spacing w:before="0" w:after="20"/>
-      </w:pPr>
-      <w:r>
-        <w:rPr>
-          <w:sz w:val="20"/>
-        </w:rPr>
-        <w:t>CONEXIÓN: Krugman tiene dos grandes contribuciones: la Nueva Teoría del Comercio (1979-80) y la Nueva Geografía Económica (1991). Hoy vemos ambas.</w:t>
+        <w:t xml:space="preserve"> S5  Edward Chamberlin y la competencia monopolística (1933)</w:t>
+      </w:r>
+    </w:p>
+    <w:p>
+      <w:pPr>
+        <w:spacing w:before="0" w:after="20"/>
+      </w:pPr>
+      <w:r>
+        <w:rPr>
+          <w:sz w:val="20"/>
+        </w:rPr>
+        <w:t>CHAMBERLIN Y LA COMPETENCIA MONOPOLÍSTICA (10 minutos)</w:t>
+      </w:r>
+    </w:p>
+    <w:p>
+      <w:pPr>
+        <w:spacing w:before="0" w:after="20"/>
+      </w:pPr>
+      <w:r>
+        <w:rPr>
+          <w:sz w:val="20"/>
+        </w:rPr>
+      </w:r>
+    </w:p>
+    <w:p>
+      <w:pPr>
+        <w:spacing w:before="0" w:after="20"/>
+      </w:pPr>
+      <w:r>
+        <w:rPr>
+          <w:sz w:val="20"/>
+        </w:rPr>
+        <w:t>QUIÉN ERA: Edward Hastings Chamberlin (1899-1967) fue un economista estadounidense que hizo toda su carrera en Harvard. Su libro de 1933, The Theory of Monopolistic Competition, cambió la forma de pensar los mercados. Antes de Chamberlin, la teoría económica tenía dos modelos: competencia perfecta (muchas firmas, producto idéntico) y monopolio (una sola firma). Chamberlin mostró que la mayoría de los mercados reales no encajan en ninguno de los dos: hay muchas firmas, pero cada una tiene un producto ligeramente diferente.</w:t>
+      </w:r>
+    </w:p>
+    <w:p>
+      <w:pPr>
+        <w:spacing w:before="0" w:after="20"/>
+      </w:pPr>
+      <w:r>
+        <w:rPr>
+          <w:sz w:val="20"/>
+        </w:rPr>
+      </w:r>
+    </w:p>
+    <w:p>
+      <w:pPr>
+        <w:spacing w:before="0" w:after="20"/>
+      </w:pPr>
+      <w:r>
+        <w:rPr>
+          <w:sz w:val="20"/>
+        </w:rPr>
+        <w:t>CONTRA QUIÉN DISCUTE: Chamberlin discute directamente con el marco de competencia perfecta de Alfred Marshall, que era el paradigma dominante en economía. Marshall asumía que las firmas producen bienes idénticos — pero en la realidad, un restaurante no es igual a otro, un auto no es igual a otro. Chamberlin formaliza esa diferenciación.</w:t>
+      </w:r>
+    </w:p>
+    <w:p>
+      <w:pPr>
+        <w:spacing w:before="0" w:after="20"/>
+      </w:pPr>
+      <w:r>
+        <w:rPr>
+          <w:sz w:val="20"/>
+        </w:rPr>
+      </w:r>
+    </w:p>
+    <w:p>
+      <w:pPr>
+        <w:spacing w:before="0" w:after="20"/>
+      </w:pPr>
+      <w:r>
+        <w:rPr>
+          <w:sz w:val="20"/>
+        </w:rPr>
+        <w:t>COINCIDENCIA CON ROBINSON: Joan Robinson (1903-1983), economista de Cambridge, publicó The Economics of Imperfect Competition el mismo año, 1933. Llegaron a conclusiones parecidas de forma independiente. Robinson era más heterodoxa — terminó simpatizando con posiciones marxistas y post-keynesianas. Chamberlin se mantuvo dentro de la ortodoxia neoclásica.</w:t>
+      </w:r>
+    </w:p>
+    <w:p>
+      <w:pPr>
+        <w:spacing w:before="0" w:after="20"/>
+      </w:pPr>
+      <w:r>
+        <w:rPr>
+          <w:sz w:val="20"/>
+        </w:rPr>
+      </w:r>
+    </w:p>
+    <w:p>
+      <w:pPr>
+        <w:spacing w:before="0" w:after="20"/>
+      </w:pPr>
+      <w:r>
+        <w:rPr>
+          <w:sz w:val="20"/>
+        </w:rPr>
+        <w:t>CONEXIÓN CON LOS MARXISTAS: La pregunta que a veces surge es: ¿qué relación tiene Chamberlin con la teoría marxista del monopolio? Chamberlin NO era marxista. Pero su trabajo demostró que la competencia perfecta es una ficción — las firmas tienen poder de mercado real. Los economistas marxistas de la escuela de Monthly Review (Paul Sweezy, Paul Baran) usaron esa idea para argumentar que el capitalismo tiende inevitablemente a la concentración monopolista. Sweezy en "Monopoly Capital" (1966) se apoyó en la noción de poder de mercado que Chamberlin había formalizado. Pero Chamberlin les dio la herramienta sin compartir la conclusión política: él quería describir la realidad con más precisión, no cuestionar el sistema.</w:t>
+      </w:r>
+    </w:p>
+    <w:p>
+      <w:pPr>
+        <w:spacing w:before="0" w:after="20"/>
+      </w:pPr>
+      <w:r>
+        <w:rPr>
+          <w:sz w:val="20"/>
+        </w:rPr>
+      </w:r>
+    </w:p>
+    <w:p>
+      <w:pPr>
+        <w:spacing w:before="0" w:after="20"/>
+      </w:pPr>
+      <w:r>
+        <w:rPr>
+          <w:sz w:val="20"/>
+        </w:rPr>
+        <w:t>PREGUNTA PARA ESTUDIANTES: "Si cada firma tiene algo de poder de mercado, ¿eso es bueno o malo para los consumidores? ¿Más variedad compensa precios más altos?"</w:t>
+      </w:r>
+    </w:p>
+    <w:p>
+      <w:pPr>
+        <w:spacing w:before="0" w:after="20"/>
+      </w:pPr>
+      <w:r>
+        <w:rPr>
+          <w:sz w:val="20"/>
+        </w:rPr>
+      </w:r>
+    </w:p>
+    <w:p>
+      <w:pPr>
+        <w:spacing w:before="0" w:after="20"/>
+      </w:pPr>
+      <w:r>
+        <w:rPr>
+          <w:sz w:val="20"/>
+        </w:rPr>
+        <w:t>DATO: Su libro tuvo 8 ediciones en vida. Chamberlin fue candidato al Nobel pero murió en 1967, un año antes de que se creara el premio de economía.</w:t>
       </w:r>
     </w:p>
     <w:p>
@@ -1189,146 +1221,241 @@
           <w:b/>
           <w:sz w:val="20"/>
         </w:rPr>
-        <w:t xml:space="preserve"> S6  Competencia monopolística — la estructura de mercado que necesitamos</w:t>
-      </w:r>
-    </w:p>
-    <w:p>
-      <w:pPr>
-        <w:spacing w:before="0" w:after="20"/>
-      </w:pPr>
-      <w:r>
-        <w:rPr>
-          <w:sz w:val="20"/>
-        </w:rPr>
-        <w:t>COMPETENCIA MONOPOLÍSTICA (10 minutos)</w:t>
-      </w:r>
-    </w:p>
-    <w:p>
-      <w:pPr>
-        <w:spacing w:before="0" w:after="20"/>
-      </w:pPr>
-      <w:r>
-        <w:rPr>
-          <w:sz w:val="20"/>
-        </w:rPr>
-        <w:t>"Antes de entrar al modelo de Krugman, necesitamos entender la estructura de mercado que usa. No es competencia perfecta (porque necesitamos diferenciación y costos fijos) ni monopolio (porque hay muchas firmas). Es competencia monopolística."</w:t>
-      </w:r>
-    </w:p>
-    <w:p>
-      <w:pPr>
-        <w:spacing w:before="0" w:after="20"/>
-      </w:pPr>
-      <w:r>
-        <w:rPr>
-          <w:sz w:val="20"/>
-        </w:rPr>
-      </w:r>
-    </w:p>
-    <w:p>
-      <w:pPr>
-        <w:spacing w:before="0" w:after="20"/>
-      </w:pPr>
-      <w:r>
-        <w:rPr>
-          <w:sz w:val="20"/>
-        </w:rPr>
-        <w:t>EXPLICACIÓN PASO A PASO:</w:t>
-      </w:r>
-    </w:p>
-    <w:p>
-      <w:pPr>
-        <w:spacing w:before="0" w:after="20"/>
-      </w:pPr>
-      <w:r>
-        <w:rPr>
-          <w:sz w:val="20"/>
-        </w:rPr>
-        <w:t>"En competencia perfecta, todos producen lo mismo y nadie tiene poder de mercado. En monopolio, una sola firma domina. Competencia monopolística es el punto medio: muchas firmas, pero cada una tiene un producto ligeramente diferente. Pensá en restaurantes: hay muchos, pero cada uno tiene su menú, su estilo, su ubicación. O en autos: hay muchas marcas, pero un VW Golf no es lo mismo que un Peugeot 308."</w:t>
-      </w:r>
-    </w:p>
-    <w:p>
-      <w:pPr>
-        <w:spacing w:before="0" w:after="20"/>
-      </w:pPr>
-      <w:r>
-        <w:rPr>
-          <w:sz w:val="20"/>
-        </w:rPr>
-      </w:r>
-    </w:p>
-    <w:p>
-      <w:pPr>
-        <w:spacing w:before="0" w:after="20"/>
-      </w:pPr>
-      <w:r>
-        <w:rPr>
-          <w:sz w:val="20"/>
-        </w:rPr>
-        <w:t>DIXIT-STIGLITZ:</w:t>
-      </w:r>
-    </w:p>
-    <w:p>
-      <w:pPr>
-        <w:spacing w:before="0" w:after="20"/>
-      </w:pPr>
-      <w:r>
-        <w:rPr>
-          <w:sz w:val="20"/>
-        </w:rPr>
-        <w:t>"En 1977, dos economistas — Dixit y Stiglitz — formalizaron matemáticamente la idea de que los consumidores valoran la variedad. Su función de utilidad dice: prefiero consumir un poco de muchas variedades que mucho de una sola. Esto se conoce como 'amor por la variedad' (love of variety)."</w:t>
-      </w:r>
-    </w:p>
-    <w:p>
-      <w:pPr>
-        <w:spacing w:before="0" w:after="20"/>
-      </w:pPr>
-      <w:r>
-        <w:rPr>
-          <w:sz w:val="20"/>
-        </w:rPr>
-      </w:r>
-    </w:p>
-    <w:p>
-      <w:pPr>
-        <w:spacing w:before="0" w:after="20"/>
-      </w:pPr>
-      <w:r>
-        <w:rPr>
-          <w:sz w:val="20"/>
-        </w:rPr>
-        <w:t>"La fórmula del slide es la utilidad CES (elasticidad de sustitución constante). El parámetro rho controla cuánto valoro la variedad: cuanto más bajo, más valoro tener opciones distintas."</w:t>
-      </w:r>
-    </w:p>
-    <w:p>
-      <w:pPr>
-        <w:spacing w:before="0" w:after="20"/>
-      </w:pPr>
-      <w:r>
-        <w:rPr>
-          <w:sz w:val="20"/>
-        </w:rPr>
-      </w:r>
-    </w:p>
-    <w:p>
-      <w:pPr>
-        <w:spacing w:before="0" w:after="20"/>
-      </w:pPr>
-      <w:r>
-        <w:rPr>
-          <w:sz w:val="20"/>
-        </w:rPr>
-        <w:t>KRUGMAN 1979:</w:t>
-      </w:r>
-    </w:p>
-    <w:p>
-      <w:pPr>
-        <w:spacing w:before="0" w:after="20"/>
-      </w:pPr>
-      <w:r>
-        <w:rPr>
-          <w:sz w:val="20"/>
-        </w:rPr>
-        <w:t>"Lo genial de Krugman fue tomar este marco y aplicarlo al comercio: si los consumidores valoran la variedad, y producir cada variedad tiene un costo fijo, entonces abrir el comercio agranda el mercado, permite más variedades y menor costo por unidad. ¡Comercio entre países idénticos!"</w:t>
+        <w:t xml:space="preserve"> S6  Dixit-Stiglitz (1977) — Formalizar el amor por la variedad</w:t>
+      </w:r>
+    </w:p>
+    <w:p>
+      <w:pPr>
+        <w:spacing w:before="0" w:after="20"/>
+      </w:pPr>
+      <w:r>
+        <w:rPr>
+          <w:sz w:val="20"/>
+        </w:rPr>
+        <w:t>DIXIT-STIGLITZ (10 minutos)</w:t>
+      </w:r>
+    </w:p>
+    <w:p>
+      <w:pPr>
+        <w:spacing w:before="0" w:after="20"/>
+      </w:pPr>
+      <w:r>
+        <w:rPr>
+          <w:sz w:val="20"/>
+        </w:rPr>
+      </w:r>
+    </w:p>
+    <w:p>
+      <w:pPr>
+        <w:spacing w:before="0" w:after="20"/>
+      </w:pPr>
+      <w:r>
+        <w:rPr>
+          <w:sz w:val="20"/>
+        </w:rPr>
+        <w:t>QUIÉNES ERAN:</w:t>
+      </w:r>
+    </w:p>
+    <w:p>
+      <w:pPr>
+        <w:spacing w:before="0" w:after="20"/>
+      </w:pPr>
+      <w:r>
+        <w:rPr>
+          <w:sz w:val="20"/>
+        </w:rPr>
+        <w:t>Avinash Dixit (1944-) es un economista indio-estadounidense que hizo su carrera en Princeton. Es uno de los teóricos más elegantes de la microeconomía moderna. Joseph Stiglitz (1943-) es más conocido: ganó el Nobel en 2001 por su trabajo sobre asimetría de información (no por este paper, sino por sus aportes sobre mercados con información imperfecta). Pero el paper de 1977 con Dixit es probablemente el más citado de toda su carrera.</w:t>
+      </w:r>
+    </w:p>
+    <w:p>
+      <w:pPr>
+        <w:spacing w:before="0" w:after="20"/>
+      </w:pPr>
+      <w:r>
+        <w:rPr>
+          <w:sz w:val="20"/>
+        </w:rPr>
+      </w:r>
+    </w:p>
+    <w:p>
+      <w:pPr>
+        <w:spacing w:before="0" w:after="20"/>
+      </w:pPr>
+      <w:r>
+        <w:rPr>
+          <w:sz w:val="20"/>
+        </w:rPr>
+        <w:t>EL PROBLEMA QUE RESOLVIERON:</w:t>
+      </w:r>
+    </w:p>
+    <w:p>
+      <w:pPr>
+        <w:spacing w:before="0" w:after="20"/>
+      </w:pPr>
+      <w:r>
+        <w:rPr>
+          <w:sz w:val="20"/>
+        </w:rPr>
+        <w:t>"En los años 70, los economistas tenían un problema técnico: sabían que los consumidores valoran la variedad (Chamberlin lo había dicho en los 30s), pero no tenían una función de utilidad manejable que lo capturara. Las funciones estándar (Cobb-Douglas, funciones aditivas) no lo resolvían bien cuando había costos fijos y un número variable de productos."</w:t>
+      </w:r>
+    </w:p>
+    <w:p>
+      <w:pPr>
+        <w:spacing w:before="0" w:after="20"/>
+      </w:pPr>
+      <w:r>
+        <w:rPr>
+          <w:sz w:val="20"/>
+        </w:rPr>
+      </w:r>
+    </w:p>
+    <w:p>
+      <w:pPr>
+        <w:spacing w:before="0" w:after="20"/>
+      </w:pPr>
+      <w:r>
+        <w:rPr>
+          <w:sz w:val="20"/>
+        </w:rPr>
+        <w:t>"Dixit y Stiglitz crearon la función CES que ven en el slide. Es una suma de todas las variedades disponibles, elevada a una potencia. Lo elegante es que captura dos cosas a la vez: (1) me gusta consumir de todas las variedades, y (2) puedo sustituir parcialmente entre variedades, pero no del todo."</w:t>
+      </w:r>
+    </w:p>
+    <w:p>
+      <w:pPr>
+        <w:spacing w:before="0" w:after="20"/>
+      </w:pPr>
+      <w:r>
+        <w:rPr>
+          <w:sz w:val="20"/>
+        </w:rPr>
+      </w:r>
+    </w:p>
+    <w:p>
+      <w:pPr>
+        <w:spacing w:before="0" w:after="20"/>
+      </w:pPr>
+      <w:r>
+        <w:rPr>
+          <w:sz w:val="20"/>
+        </w:rPr>
+        <w:t>LA FÓRMULA EN SIMPLE:</w:t>
+      </w:r>
+    </w:p>
+    <w:p>
+      <w:pPr>
+        <w:spacing w:before="0" w:after="20"/>
+      </w:pPr>
+      <w:r>
+        <w:rPr>
+          <w:sz w:val="20"/>
+        </w:rPr>
+        <w:t>"No se asusten por la fórmula. Lo que dice es: mi felicidad depende de cuántas variedades consumo y cuánto de cada una. Si hay 10 variedades de helado, soy más feliz probando un poco de cada una que comiendo mucho de una sola. Eso es 'amor por la variedad'."</w:t>
+      </w:r>
+    </w:p>
+    <w:p>
+      <w:pPr>
+        <w:spacing w:before="0" w:after="20"/>
+      </w:pPr>
+      <w:r>
+        <w:rPr>
+          <w:sz w:val="20"/>
+        </w:rPr>
+      </w:r>
+    </w:p>
+    <w:p>
+      <w:pPr>
+        <w:spacing w:before="0" w:after="20"/>
+      </w:pPr>
+      <w:r>
+        <w:rPr>
+          <w:sz w:val="20"/>
+        </w:rPr>
+        <w:t>"El parámetro rho (ρ) es clave: si ρ está cerca de 1, las variedades son casi iguales (me da lo mismo una u otra). Si ρ es bajo, cada variedad es muy diferente y valoro mucho tener acceso a todas."</w:t>
+      </w:r>
+    </w:p>
+    <w:p>
+      <w:pPr>
+        <w:spacing w:before="0" w:after="20"/>
+      </w:pPr>
+      <w:r>
+        <w:rPr>
+          <w:sz w:val="20"/>
+        </w:rPr>
+      </w:r>
+    </w:p>
+    <w:p>
+      <w:pPr>
+        <w:spacing w:before="0" w:after="20"/>
+      </w:pPr>
+      <w:r>
+        <w:rPr>
+          <w:sz w:val="20"/>
+        </w:rPr>
+        <w:t>CONTRA QUIÉN DISCUTEN:</w:t>
+      </w:r>
+    </w:p>
+    <w:p>
+      <w:pPr>
+        <w:spacing w:before="0" w:after="20"/>
+      </w:pPr>
+      <w:r>
+        <w:rPr>
+          <w:sz w:val="20"/>
+        </w:rPr>
+        <w:t>"Discuten con la teoría estándar que asumía bienes homogéneos o que trataba las variedades como bienes completamente separados. Antes de Dixit-Stiglitz, si querías modelar 100 variedades, necesitabas 100 ecuaciones. Ellos lo resolvieron con una sola función que escala con n (el número de variedades)."</w:t>
+      </w:r>
+    </w:p>
+    <w:p>
+      <w:pPr>
+        <w:spacing w:before="0" w:after="20"/>
+      </w:pPr>
+      <w:r>
+        <w:rPr>
+          <w:sz w:val="20"/>
+        </w:rPr>
+      </w:r>
+    </w:p>
+    <w:p>
+      <w:pPr>
+        <w:spacing w:before="0" w:after="20"/>
+      </w:pPr>
+      <w:r>
+        <w:rPr>
+          <w:sz w:val="20"/>
+        </w:rPr>
+        <w:t>POR QUÉ IMPORTA PARA EL COMERCIO:</w:t>
+      </w:r>
+    </w:p>
+    <w:p>
+      <w:pPr>
+        <w:spacing w:before="0" w:after="20"/>
+      </w:pPr>
+      <w:r>
+        <w:rPr>
+          <w:sz w:val="20"/>
+        </w:rPr>
+        <w:t>"El resultado clave es que el número de variedades en equilibrio depende del tamaño del mercado. Mercado más grande → más firmas pueden cubrir sus costos fijos → más variedades. Esto es exactamente lo que Krugman necesitaba para explicar por qué abrir el comercio (= agrandar el mercado) genera más variedad."</w:t>
+      </w:r>
+    </w:p>
+    <w:p>
+      <w:pPr>
+        <w:spacing w:before="0" w:after="20"/>
+      </w:pPr>
+      <w:r>
+        <w:rPr>
+          <w:sz w:val="20"/>
+        </w:rPr>
+      </w:r>
+    </w:p>
+    <w:p>
+      <w:pPr>
+        <w:spacing w:before="0" w:after="20"/>
+      </w:pPr>
+      <w:r>
+        <w:rPr>
+          <w:sz w:val="20"/>
+        </w:rPr>
+        <w:t>DATO: Este paper se publicó en la American Economic Review en 1977. Hoy tiene más de 20.000 citas — es uno de los papers más citados de la historia de la economía. Prácticamente toda la nueva teoría del comercio, la nueva geografía económica y la macroeconomía de variedades se construyen sobre Dixit-Stiglitz.</w:t>
       </w:r>
     </w:p>
     <w:p>
@@ -1374,7 +1501,253 @@
           <w:b/>
           <w:sz w:val="20"/>
         </w:rPr>
-        <w:t xml:space="preserve"> S7  El modelo de Krugman  —  Rendimientos crecientes, diferenciación y comercio intraindustrial</w:t>
+        <w:t xml:space="preserve"> S7  Paul Krugman — El arquitecto de la Nueva Teoría del Comercio</w:t>
+      </w:r>
+    </w:p>
+    <w:p>
+      <w:pPr>
+        <w:spacing w:before="0" w:after="20"/>
+      </w:pPr>
+      <w:r>
+        <w:rPr>
+          <w:sz w:val="20"/>
+        </w:rPr>
+        <w:t>BIOGRAFÍA KRUGMAN (5 minutos)</w:t>
+      </w:r>
+    </w:p>
+    <w:p>
+      <w:pPr>
+        <w:spacing w:before="0" w:after="20"/>
+      </w:pPr>
+      <w:r>
+        <w:rPr>
+          <w:sz w:val="20"/>
+        </w:rPr>
+        <w:t>Paul Krugman nació en 1953, estudió en Yale y MIT. Su contribución clave fue formalizar algo que los economistas intuían pero no podían modelar: que gran parte del comercio entre países desarrollados no se explicaba por diferencias en dotaciones sino por economías de escala y diferenciación de productos.</w:t>
+      </w:r>
+    </w:p>
+    <w:p>
+      <w:pPr>
+        <w:spacing w:before="0" w:after="20"/>
+      </w:pPr>
+      <w:r>
+        <w:rPr>
+          <w:sz w:val="20"/>
+        </w:rPr>
+      </w:r>
+    </w:p>
+    <w:p>
+      <w:pPr>
+        <w:spacing w:before="0" w:after="20"/>
+      </w:pPr>
+      <w:r>
+        <w:rPr>
+          <w:sz w:val="20"/>
+        </w:rPr>
+        <w:t>CONTEXTO HISTÓRICO: En los años 70-80, la evidencia mostraba que el comercio entre países ricos (la tríada que acabamos de ver) crecía explosivamente, y era mayormente intraindustrial. Los modelos de competencia perfecta no podían explicar esto. Krugman tomó las herramientas que acabamos de ver — la competencia monopolística de Chamberlin y la formalización de Dixit-Stiglitz — y las aplicó al comercio internacional.</w:t>
+      </w:r>
+    </w:p>
+    <w:p>
+      <w:pPr>
+        <w:spacing w:before="0" w:after="20"/>
+      </w:pPr>
+      <w:r>
+        <w:rPr>
+          <w:sz w:val="20"/>
+        </w:rPr>
+      </w:r>
+    </w:p>
+    <w:p>
+      <w:pPr>
+        <w:spacing w:before="0" w:after="20"/>
+      </w:pPr>
+      <w:r>
+        <w:rPr>
+          <w:sz w:val="20"/>
+        </w:rPr>
+        <w:t>¿CON QUIÉN DISCUTE? Con el "núcleo" de la teoría tradicional: Ricardo y H-O asumen rendimientos constantes y competencia perfecta. Krugman introduce rendimientos crecientes y competencia imperfecta como motor del comercio.</w:t>
+      </w:r>
+    </w:p>
+    <w:p>
+      <w:pPr>
+        <w:spacing w:before="0" w:after="20"/>
+      </w:pPr>
+      <w:r>
+        <w:rPr>
+          <w:sz w:val="20"/>
+        </w:rPr>
+      </w:r>
+    </w:p>
+    <w:p>
+      <w:pPr>
+        <w:spacing w:before="0" w:after="20"/>
+      </w:pPr>
+      <w:r>
+        <w:rPr>
+          <w:sz w:val="20"/>
+        </w:rPr>
+        <w:t>ANÉCDOTA: El propio Krugman cuenta que la idea le vino al notar que el comercio EEUU-Canadá en manufacturas similares era enorme, algo que H-O no podía explicar bien.</w:t>
+      </w:r>
+    </w:p>
+    <w:p>
+      <w:pPr>
+        <w:spacing w:before="0" w:after="20"/>
+      </w:pPr>
+      <w:r>
+        <w:rPr>
+          <w:sz w:val="20"/>
+        </w:rPr>
+      </w:r>
+    </w:p>
+    <w:p>
+      <w:pPr>
+        <w:spacing w:before="0" w:after="20"/>
+      </w:pPr>
+      <w:r>
+        <w:rPr>
+          <w:sz w:val="20"/>
+        </w:rPr>
+        <w:t>CITA: "Las economías de escala internas son, en la práctica, la fuerza principal detrás del comercio intraindustrial."</w:t>
+      </w:r>
+    </w:p>
+    <w:p>
+      <w:pPr>
+        <w:spacing w:before="0" w:after="20"/>
+      </w:pPr>
+      <w:r>
+        <w:rPr>
+          <w:sz w:val="20"/>
+        </w:rPr>
+      </w:r>
+    </w:p>
+    <w:p>
+      <w:pPr>
+        <w:spacing w:before="0" w:after="20"/>
+      </w:pPr>
+      <w:r>
+        <w:rPr>
+          <w:sz w:val="20"/>
+        </w:rPr>
+        <w:t>CONEXIÓN: "Ya vimos a Chamberlin (la estructura de mercado), a Dixit-Stiglitz (la formalización matemática). Krugman es el que toma todo eso y lo convierte en una teoría del comercio internacional. Tiene dos grandes contribuciones: la Nueva Teoría del Comercio (1979-80) y la Nueva Geografía Económica (1991). Hoy vemos ambas."</w:t>
+      </w:r>
+    </w:p>
+    <w:p>
+      <w:pPr>
+        <w:spacing w:before="160" w:after="40"/>
+      </w:pPr>
+      <w:r>
+        <w:rPr>
+          <w:b/>
+          <w:sz w:val="20"/>
+        </w:rPr>
+        <w:t xml:space="preserve"> S8  Krugman (1979) — De Dixit-Stiglitz al comercio internacional</w:t>
+      </w:r>
+    </w:p>
+    <w:p>
+      <w:pPr>
+        <w:spacing w:before="0" w:after="20"/>
+      </w:pPr>
+      <w:r>
+        <w:rPr>
+          <w:sz w:val="20"/>
+        </w:rPr>
+        <w:t>EL SALTO DE KRUGMAN (5 minutos)</w:t>
+      </w:r>
+    </w:p>
+    <w:p>
+      <w:pPr>
+        <w:spacing w:before="0" w:after="20"/>
+      </w:pPr>
+      <w:r>
+        <w:rPr>
+          <w:sz w:val="20"/>
+        </w:rPr>
+      </w:r>
+    </w:p>
+    <w:p>
+      <w:pPr>
+        <w:spacing w:before="0" w:after="20"/>
+      </w:pPr>
+      <w:r>
+        <w:rPr>
+          <w:sz w:val="20"/>
+        </w:rPr>
+        <w:t>"Ahora viene la jugada genial. Chamberlin nos dio la estructura de mercado (competencia monopolística). Dixit y Stiglitz nos dieron la herramienta matemática (la función CES con amor por la variedad). Pero ninguno de los dos habló de comercio internacional."</w:t>
+      </w:r>
+    </w:p>
+    <w:p>
+      <w:pPr>
+        <w:spacing w:before="0" w:after="20"/>
+      </w:pPr>
+      <w:r>
+        <w:rPr>
+          <w:sz w:val="20"/>
+        </w:rPr>
+      </w:r>
+    </w:p>
+    <w:p>
+      <w:pPr>
+        <w:spacing w:before="0" w:after="20"/>
+      </w:pPr>
+      <w:r>
+        <w:rPr>
+          <w:sz w:val="20"/>
+        </w:rPr>
+        <w:t>"Krugman en 1979 tomó ese modelo y le agregó un ingrediente simple: dos países que pueden comerciar entre sí. ¿Qué pasa? El mercado se duplica. Más mercado significa que más variedades pueden cubrir sus costos fijos. Resultado: hay más variedades disponibles Y cada variedad se produce a mayor escala (menor costo). Los consumidores de ambos países ganan."</w:t>
+      </w:r>
+    </w:p>
+    <w:p>
+      <w:pPr>
+        <w:spacing w:before="0" w:after="20"/>
+      </w:pPr>
+      <w:r>
+        <w:rPr>
+          <w:sz w:val="20"/>
+        </w:rPr>
+      </w:r>
+    </w:p>
+    <w:p>
+      <w:pPr>
+        <w:spacing w:before="0" w:after="20"/>
+      </w:pPr>
+      <w:r>
+        <w:rPr>
+          <w:sz w:val="20"/>
+        </w:rPr>
+        <w:t>"Y lo más importante: esto funciona incluso si los dos países son IDÉNTICOS en dotaciones, tecnología, tamaño, todo. No hace falta que uno sea 'mejor' en algo. El comercio surge de la escala y la variedad, no de las diferencias. Eso es lo revolucionario."</w:t>
+      </w:r>
+    </w:p>
+    <w:p>
+      <w:pPr>
+        <w:spacing w:before="0" w:after="20"/>
+      </w:pPr>
+      <w:r>
+        <w:rPr>
+          <w:sz w:val="20"/>
+        </w:rPr>
+      </w:r>
+    </w:p>
+    <w:p>
+      <w:pPr>
+        <w:spacing w:before="0" w:after="20"/>
+      </w:pPr>
+      <w:r>
+        <w:rPr>
+          <w:sz w:val="20"/>
+        </w:rPr>
+        <w:t>CONEXIÓN: "Ahora vamos a desmenuzar este mecanismo paso a paso. Pero ya tienen la arquitectura completa: Chamberlin (1933) → Dixit-Stiglitz (1977) → Krugman (1979). Tres décadas para armar el edificio."</w:t>
+      </w:r>
+    </w:p>
+    <w:p>
+      <w:pPr>
+        <w:spacing w:before="160" w:after="40"/>
+      </w:pPr>
+      <w:r>
+        <w:rPr>
+          <w:b/>
+          <w:sz w:val="20"/>
+        </w:rPr>
+        <w:t xml:space="preserve"> S9  El modelo de Krugman  —  Rendimientos crecientes, diferenciación y comercio intraindustrial</w:t>
       </w:r>
     </w:p>
     <w:p>
@@ -1396,7 +1769,7 @@
         <w:rPr>
           <w:sz w:val="20"/>
         </w:rPr>
-        <w:t>"Ya vimos el problema: H-O no explica el comercio entre países similares. Ahora vamos a armar la solución. Krugman combina tres ingredientes: rendimientos crecientes, diferenciación de productos y competencia monopolística. Con eso va a explicar por qué existe el comercio intraindustrial."</w:t>
+        <w:t>"Ya tenemos las bases teóricas: Chamberlin nos dio la competencia monopolística, Dixit-Stiglitz la formalizaron con amor por la variedad, y Krugman la aplicó al comercio. Ahora vamos a ver cómo funciona el modelo paso a paso: rendimientos crecientes, costos fijos, el mecanismo completo y las ganancias del comercio."</w:t>
       </w:r>
     </w:p>
     <w:p>
@@ -1408,7 +1781,7 @@
           <w:b/>
           <w:sz w:val="20"/>
         </w:rPr>
-        <w:t xml:space="preserve"> S8  Rendimientos crecientes: la intuición clave</w:t>
+        <w:t xml:space="preserve"> S10  Rendimientos crecientes: la intuición clave</w:t>
       </w:r>
     </w:p>
     <w:p>
@@ -1592,7 +1965,7 @@
           <w:b/>
           <w:sz w:val="20"/>
         </w:rPr>
-        <w:t xml:space="preserve"> S9  Economías de escala internas vs externas</w:t>
+        <w:t xml:space="preserve"> S11  Economías de escala internas vs externas</w:t>
       </w:r>
     </w:p>
     <w:p>
@@ -1809,7 +2182,7 @@
           <w:b/>
           <w:sz w:val="20"/>
         </w:rPr>
-        <w:t xml:space="preserve"> S10  Escala y especialización sin ventaja comparativa</w:t>
+        <w:t xml:space="preserve"> S12  Escala y especialización sin ventaja comparativa</w:t>
       </w:r>
     </w:p>
     <w:p>
@@ -1938,7 +2311,7 @@
           <w:b/>
           <w:sz w:val="20"/>
         </w:rPr>
-        <w:t xml:space="preserve"> S11  Comercio intraindustrial: el hecho a explicar</w:t>
+        <w:t xml:space="preserve"> S13  Comercio intraindustrial: el hecho a explicar</w:t>
       </w:r>
     </w:p>
     <w:p>
@@ -2078,7 +2451,7 @@
           <w:b/>
           <w:sz w:val="20"/>
         </w:rPr>
-        <w:t xml:space="preserve"> S12  El mecanismo Krugman en 4 pasos</w:t>
+        <w:t xml:space="preserve"> S14  El mecanismo Krugman en 4 pasos</w:t>
       </w:r>
     </w:p>
     <w:p>
@@ -2238,7 +2611,7 @@
           <w:b/>
           <w:sz w:val="20"/>
         </w:rPr>
-        <w:t xml:space="preserve"> S13  Ganancias del comercio: variedad y escala</w:t>
+        <w:t xml:space="preserve"> S15  Ganancias del comercio: variedad y escala</w:t>
       </w:r>
     </w:p>
     <w:p>
@@ -2367,7 +2740,7 @@
           <w:b/>
           <w:sz w:val="20"/>
         </w:rPr>
-        <w:t xml:space="preserve"> S14  Tabla comparativa de teorías</w:t>
+        <w:t xml:space="preserve"> S16  Tabla comparativa de teorías</w:t>
       </w:r>
     </w:p>
     <w:p>
@@ -2521,7 +2894,7 @@
           <w:b/>
           <w:sz w:val="20"/>
         </w:rPr>
-        <w:t xml:space="preserve"> S15  Medir el comercio intraindustrial  —  Grubel-Lloyd, evidencia comparada y el caso argentino</w:t>
+        <w:t xml:space="preserve"> S17  Medir el comercio intraindustrial  —  Grubel-Lloyd, evidencia comparada y el caso argentino</w:t>
       </w:r>
     </w:p>
     <w:p>
@@ -2555,7 +2928,7 @@
           <w:b/>
           <w:sz w:val="20"/>
         </w:rPr>
-        <w:t xml:space="preserve"> S16  ¿Qué vieron Grubel y Lloyd?</w:t>
+        <w:t xml:space="preserve"> S18  ¿Qué vieron Grubel y Lloyd?</w:t>
       </w:r>
     </w:p>
     <w:p>
@@ -2652,7 +3025,7 @@
           <w:b/>
           <w:sz w:val="20"/>
         </w:rPr>
-        <w:t xml:space="preserve"> S17  Índice de Grubel-Lloyd</w:t>
+        <w:t xml:space="preserve"> S19  Índice de Grubel-Lloyd</w:t>
       </w:r>
     </w:p>
     <w:p>
@@ -2878,7 +3251,7 @@
           <w:b/>
           <w:sz w:val="20"/>
         </w:rPr>
-        <w:t xml:space="preserve"> S18  IIT horizontal vs vertical</w:t>
+        <w:t xml:space="preserve"> S20  IIT horizontal vs vertical</w:t>
       </w:r>
     </w:p>
     <w:p>
@@ -3061,7 +3434,7 @@
           <w:b/>
           <w:sz w:val="20"/>
         </w:rPr>
-        <w:t xml:space="preserve"> S19  Evidencia comparada: ¿dónde hay más IIT?</w:t>
+        <w:t xml:space="preserve"> S21  Evidencia comparada: ¿dónde hay más IIT?</w:t>
       </w:r>
     </w:p>
     <w:p>
@@ -3223,7 +3596,7 @@
           <w:b/>
           <w:sz w:val="20"/>
         </w:rPr>
-        <w:t xml:space="preserve"> S20  Caso Mercosur autos: Krugman en acción</w:t>
+        <w:t xml:space="preserve"> S22  Caso Mercosur autos: Krugman en acción</w:t>
       </w:r>
     </w:p>
     <w:p>
@@ -3395,7 +3768,7 @@
           <w:b/>
           <w:sz w:val="20"/>
         </w:rPr>
-        <w:t xml:space="preserve"> S21  Argentina y el comercio intraindustrial: ¿excepción o patrón?</w:t>
+        <w:t xml:space="preserve"> S23  Argentina y el comercio intraindustrial: ¿excepción o patrón?</w:t>
       </w:r>
     </w:p>
     <w:p>
@@ -3569,7 +3942,7 @@
           <w:b/>
           <w:sz w:val="20"/>
         </w:rPr>
-        <w:t xml:space="preserve"> S22  Implicancias  —  Ganadores, perdedores y el tamaño del mercado</w:t>
+        <w:t xml:space="preserve"> S24  Implicancias  —  Ganadores, perdedores y el tamaño del mercado</w:t>
       </w:r>
     </w:p>
     <w:p>
@@ -3603,7 +3976,7 @@
           <w:b/>
           <w:sz w:val="20"/>
         </w:rPr>
-        <w:t xml:space="preserve"> S23  ¿Quién gana y quién pierde?</w:t>
+        <w:t xml:space="preserve"> S25  ¿Quién gana y quién pierde?</w:t>
       </w:r>
     </w:p>
     <w:p>
@@ -3808,7 +4181,7 @@
           <w:b/>
           <w:sz w:val="20"/>
         </w:rPr>
-        <w:t xml:space="preserve"> S24  El efecto home-market y el mercado efectivo</w:t>
+        <w:t xml:space="preserve"> S26  El efecto home-market y el mercado efectivo</w:t>
       </w:r>
     </w:p>
     <w:p>
@@ -4002,7 +4375,7 @@
           <w:b/>
           <w:sz w:val="20"/>
         </w:rPr>
-        <w:t xml:space="preserve"> S25  Nueva Geografía Económica: centro-periferia</w:t>
+        <w:t xml:space="preserve"> S27  Nueva Geografía Económica: centro-periferia</w:t>
       </w:r>
     </w:p>
     <w:p>
@@ -4143,7 +4516,7 @@
           <w:b/>
           <w:sz w:val="20"/>
         </w:rPr>
-        <w:t xml:space="preserve"> S26  Implicancias de política</w:t>
+        <w:t xml:space="preserve"> S28  Implicancias de política</w:t>
       </w:r>
     </w:p>
     <w:p>
@@ -4337,7 +4710,7 @@
           <w:b/>
           <w:sz w:val="20"/>
         </w:rPr>
-        <w:t xml:space="preserve"> S27  ¿Cuándo aplica mejor esta teoría?</w:t>
+        <w:t xml:space="preserve"> S29  ¿Cuándo aplica mejor esta teoría?</w:t>
       </w:r>
     </w:p>
     <w:p>
@@ -4523,7 +4896,7 @@
           <w:b/>
           <w:sz w:val="20"/>
         </w:rPr>
-        <w:t xml:space="preserve"> S28  Nueva Geografía Económica  —  ¿Por qué la producción se concentra en ciertos lugares?</w:t>
+        <w:t xml:space="preserve"> S30  Nueva Geografía Económica  —  ¿Por qué la producción se concentra en ciertos lugares?</w:t>
       </w:r>
     </w:p>
     <w:p>
@@ -4557,7 +4930,7 @@
           <w:b/>
           <w:sz w:val="20"/>
         </w:rPr>
-        <w:t xml:space="preserve"> S29  Fuerzas centrípetas vs centrífugas</w:t>
+        <w:t xml:space="preserve"> S31  Fuerzas centrípetas vs centrífugas</w:t>
       </w:r>
     </w:p>
     <w:p>
@@ -4823,7 +5196,7 @@
           <w:b/>
           <w:sz w:val="20"/>
         </w:rPr>
-        <w:t xml:space="preserve"> S30  El modelo centro-periferia de Krugman (1991)</w:t>
+        <w:t xml:space="preserve"> S32  El modelo centro-periferia de Krugman (1991)</w:t>
       </w:r>
     </w:p>
     <w:p>
@@ -5037,7 +5410,7 @@
           <w:b/>
           <w:sz w:val="20"/>
         </w:rPr>
-        <w:t xml:space="preserve"> S31  Evidencia empírica de la NGE</w:t>
+        <w:t xml:space="preserve"> S33  Evidencia empírica de la NGE</w:t>
       </w:r>
     </w:p>
     <w:p>
@@ -5188,7 +5561,7 @@
           <w:b/>
           <w:sz w:val="20"/>
         </w:rPr>
-        <w:t xml:space="preserve"> S32  NGE y Argentina: la concentración territorial</w:t>
+        <w:t xml:space="preserve"> S34  NGE y Argentina: la concentración territorial</w:t>
       </w:r>
     </w:p>
     <w:p>
@@ -5416,7 +5789,7 @@
           <w:b/>
           <w:sz w:val="20"/>
         </w:rPr>
-        <w:t xml:space="preserve"> S33  Resumen de la clase</w:t>
+        <w:t xml:space="preserve"> S35  Resumen de la clase</w:t>
       </w:r>
     </w:p>
     <w:p>
@@ -5471,7 +5844,7 @@
           <w:b/>
           <w:sz w:val="20"/>
         </w:rPr>
-        <w:t xml:space="preserve"> S34  Material complementario</w:t>
+        <w:t xml:space="preserve"> S36  Material complementario</w:t>
       </w:r>
     </w:p>
     <w:p>
@@ -5570,7 +5943,7 @@
           <w:b/>
           <w:sz w:val="20"/>
         </w:rPr>
-        <w:t xml:space="preserve"> S35  Lecturas</w:t>
+        <w:t xml:space="preserve"> S37  Lecturas</w:t>
       </w:r>
     </w:p>
     <w:p>
@@ -5689,7 +6062,7 @@
           <w:b/>
           <w:sz w:val="20"/>
         </w:rPr>
-        <w:t xml:space="preserve"> S36  Guía de lectura  —  Preguntas orientadoras para la bibliografía</w:t>
+        <w:t xml:space="preserve"> S38  Guía de lectura  —  Preguntas orientadoras para la bibliografía</w:t>
       </w:r>
     </w:p>
     <w:p>
@@ -5723,7 +6096,7 @@
           <w:b/>
           <w:sz w:val="20"/>
         </w:rPr>
-        <w:t xml:space="preserve"> S37  Próxima clase</w:t>
+        <w:t xml:space="preserve"> S39  Próxima clase</w:t>
       </w:r>
     </w:p>
     <w:p>

</xml_diff>

<commit_message>
feat(S4): agregar slides 20-21 — intuición visual del índice GL
- Slide 20: espectro GL (termómetro 0→1 con 6 sectores posicionados)
- Slide 21: scatter X vs M (diagonal = IIT, distancia = componente inter)
- Notas docente con explicación detallada para ambos gráficos
- Total: 41 slides (+2 vs anterior)

Co-Authored-By: Claude Opus 4.6 (1M context) <noreply@anthropic.com>
</commit_message>
<xml_diff>
--- a/Clases/sesion04/Notas_Docente_Clase4.docx
+++ b/Clases/sesion04/Notas_Docente_Clase4.docx
@@ -307,7 +307,7 @@
         <w:rPr>
           <w:sz w:val="18"/>
         </w:rPr>
-        <w:t xml:space="preserve">   S20: IIT horizontal vs vertical</w:t>
+        <w:t xml:space="preserve">   S20: La intuición del GL: simetría entre X y M</w:t>
       </w:r>
     </w:p>
     <w:p>
@@ -318,7 +318,7 @@
         <w:rPr>
           <w:sz w:val="18"/>
         </w:rPr>
-        <w:t xml:space="preserve">   S21: Evidencia comparada: ¿dónde hay más IIT?</w:t>
+        <w:t xml:space="preserve">   S21: La geometría del GL: la diagonal como referencia</w:t>
       </w:r>
     </w:p>
     <w:p>
@@ -329,7 +329,7 @@
         <w:rPr>
           <w:sz w:val="18"/>
         </w:rPr>
-        <w:t xml:space="preserve">   S22: Caso Mercosur autos: Krugman en acción</w:t>
+        <w:t xml:space="preserve">   S22: IIT horizontal vs vertical</w:t>
       </w:r>
     </w:p>
     <w:p>
@@ -340,7 +340,29 @@
         <w:rPr>
           <w:sz w:val="18"/>
         </w:rPr>
-        <w:t xml:space="preserve">   S23: Argentina y el comercio intraindustrial: ¿excepción o patrón?</w:t>
+        <w:t xml:space="preserve">   S23: Evidencia comparada: ¿dónde hay más IIT?</w:t>
+      </w:r>
+    </w:p>
+    <w:p>
+      <w:pPr>
+        <w:spacing w:before="0" w:after="0"/>
+      </w:pPr>
+      <w:r>
+        <w:rPr>
+          <w:sz w:val="18"/>
+        </w:rPr>
+        <w:t xml:space="preserve">   S24: Caso Mercosur autos: Krugman en acción</w:t>
+      </w:r>
+    </w:p>
+    <w:p>
+      <w:pPr>
+        <w:spacing w:before="0" w:after="0"/>
+      </w:pPr>
+      <w:r>
+        <w:rPr>
+          <w:sz w:val="18"/>
+        </w:rPr>
+        <w:t xml:space="preserve">   S25: Argentina y el comercio intraindustrial: ¿excepción o patrón?</w:t>
       </w:r>
     </w:p>
     <w:p>
@@ -363,7 +385,7 @@
         <w:rPr>
           <w:sz w:val="18"/>
         </w:rPr>
-        <w:t xml:space="preserve">   S24: Implicancias — Ganadores, perdedores y el tamaño del mercado</w:t>
+        <w:t xml:space="preserve">   S26: Implicancias — Ganadores, perdedores y el tamaño del mercado</w:t>
       </w:r>
     </w:p>
     <w:p>
@@ -374,7 +396,7 @@
         <w:rPr>
           <w:sz w:val="18"/>
         </w:rPr>
-        <w:t xml:space="preserve">   S25: ¿Quién gana y quién pierde?</w:t>
+        <w:t xml:space="preserve">   S27: ¿Quién gana y quién pierde?</w:t>
       </w:r>
     </w:p>
     <w:p>
@@ -385,7 +407,7 @@
         <w:rPr>
           <w:sz w:val="18"/>
         </w:rPr>
-        <w:t xml:space="preserve">   S26: El efecto home-market y el mercado efectivo</w:t>
+        <w:t xml:space="preserve">   S28: El efecto home-market y el mercado efectivo</w:t>
       </w:r>
     </w:p>
     <w:p>
@@ -396,7 +418,7 @@
         <w:rPr>
           <w:sz w:val="18"/>
         </w:rPr>
-        <w:t xml:space="preserve">   S27: Nueva Geografía Económica: centro-periferia</w:t>
+        <w:t xml:space="preserve">   S29: Nueva Geografía Económica: centro-periferia</w:t>
       </w:r>
     </w:p>
     <w:p>
@@ -407,7 +429,7 @@
         <w:rPr>
           <w:sz w:val="18"/>
         </w:rPr>
-        <w:t xml:space="preserve">   S28: Implicancias de política</w:t>
+        <w:t xml:space="preserve">   S30: Implicancias de política</w:t>
       </w:r>
     </w:p>
     <w:p>
@@ -418,7 +440,7 @@
         <w:rPr>
           <w:sz w:val="18"/>
         </w:rPr>
-        <w:t xml:space="preserve">   S29: ¿Cuándo aplica mejor esta teoría?</w:t>
+        <w:t xml:space="preserve">   S31: ¿Cuándo aplica mejor esta teoría?</w:t>
       </w:r>
     </w:p>
     <w:p>
@@ -441,7 +463,7 @@
         <w:rPr>
           <w:sz w:val="18"/>
         </w:rPr>
-        <w:t xml:space="preserve">   S30: Nueva Geografía Económica — ¿Por qué la producción se concentra en ciertos lugares?</w:t>
+        <w:t xml:space="preserve">   S32: Nueva Geografía Económica — ¿Por qué la producción se concentra en ciertos lugares?</w:t>
       </w:r>
     </w:p>
     <w:p>
@@ -452,7 +474,7 @@
         <w:rPr>
           <w:sz w:val="18"/>
         </w:rPr>
-        <w:t xml:space="preserve">   S31: Fuerzas centrípetas vs centrífugas</w:t>
+        <w:t xml:space="preserve">   S33: Fuerzas centrípetas vs centrífugas</w:t>
       </w:r>
     </w:p>
     <w:p>
@@ -463,7 +485,7 @@
         <w:rPr>
           <w:sz w:val="18"/>
         </w:rPr>
-        <w:t xml:space="preserve">   S32: El modelo centro-periferia de Krugman (1991)</w:t>
+        <w:t xml:space="preserve">   S34: El modelo centro-periferia de Krugman (1991)</w:t>
       </w:r>
     </w:p>
     <w:p>
@@ -474,7 +496,7 @@
         <w:rPr>
           <w:sz w:val="18"/>
         </w:rPr>
-        <w:t xml:space="preserve">   S33: Evidencia empírica de la NGE</w:t>
+        <w:t xml:space="preserve">   S35: Evidencia empírica de la NGE</w:t>
       </w:r>
     </w:p>
     <w:p>
@@ -485,7 +507,7 @@
         <w:rPr>
           <w:sz w:val="18"/>
         </w:rPr>
-        <w:t xml:space="preserve">   S34: NGE y Argentina: la concentración territorial</w:t>
+        <w:t xml:space="preserve">   S36: NGE y Argentina: la concentración territorial</w:t>
       </w:r>
     </w:p>
     <w:p>
@@ -508,7 +530,7 @@
         <w:rPr>
           <w:sz w:val="18"/>
         </w:rPr>
-        <w:t xml:space="preserve">   S35: Resumen de la clase</w:t>
+        <w:t xml:space="preserve">   S37: Resumen de la clase</w:t>
       </w:r>
     </w:p>
     <w:p>
@@ -519,7 +541,7 @@
         <w:rPr>
           <w:sz w:val="18"/>
         </w:rPr>
-        <w:t xml:space="preserve">   S36: Material complementario</w:t>
+        <w:t xml:space="preserve">   S38: Material complementario</w:t>
       </w:r>
     </w:p>
     <w:p>
@@ -530,7 +552,7 @@
         <w:rPr>
           <w:sz w:val="18"/>
         </w:rPr>
-        <w:t xml:space="preserve">   S37: Lecturas</w:t>
+        <w:t xml:space="preserve">   S39: Lecturas</w:t>
       </w:r>
     </w:p>
     <w:p>
@@ -541,7 +563,7 @@
         <w:rPr>
           <w:sz w:val="18"/>
         </w:rPr>
-        <w:t xml:space="preserve">   S38: Guía de lectura — Preguntas orientadoras para la bibliografía</w:t>
+        <w:t xml:space="preserve">   S40: Guía de lectura — Preguntas orientadoras para la bibliografía</w:t>
       </w:r>
     </w:p>
     <w:p>
@@ -552,7 +574,7 @@
         <w:rPr>
           <w:sz w:val="18"/>
         </w:rPr>
-        <w:t xml:space="preserve">   S39: Próxima clase</w:t>
+        <w:t xml:space="preserve">   S41: Próxima clase</w:t>
       </w:r>
     </w:p>
     <w:p>
@@ -3251,7 +3273,243 @@
           <w:b/>
           <w:sz w:val="20"/>
         </w:rPr>
-        <w:t xml:space="preserve"> S20  IIT horizontal vs vertical</w:t>
+        <w:t xml:space="preserve"> S20  La intuición del GL: simetría entre X y M</w:t>
+      </w:r>
+    </w:p>
+    <w:p>
+      <w:pPr>
+        <w:spacing w:before="0" w:after="20"/>
+      </w:pPr>
+      <w:r>
+        <w:rPr>
+          <w:sz w:val="20"/>
+        </w:rPr>
+        <w:t>INTUICIÓN DEL GL — ESPECTRO (5 minutos)</w:t>
+      </w:r>
+    </w:p>
+    <w:p>
+      <w:pPr>
+        <w:spacing w:before="0" w:after="20"/>
+      </w:pPr>
+      <w:r>
+        <w:rPr>
+          <w:sz w:val="20"/>
+        </w:rPr>
+        <w:t>"Antes de avanzar, asegurémonos de que la intuición del GL quede clara. Miren el espectro: a la izquierda tenemos GL = 0, puro interindustrial. Argentina exporta soja y no importa nada de soja. Es comercio de una sola dirección."</w:t>
+      </w:r>
+    </w:p>
+    <w:p>
+      <w:pPr>
+        <w:spacing w:before="0" w:after="20"/>
+      </w:pPr>
+      <w:r>
+        <w:rPr>
+          <w:sz w:val="20"/>
+        </w:rPr>
+      </w:r>
+    </w:p>
+    <w:p>
+      <w:pPr>
+        <w:spacing w:before="0" w:after="20"/>
+      </w:pPr>
+      <w:r>
+        <w:rPr>
+          <w:sz w:val="20"/>
+        </w:rPr>
+        <w:t>"A la derecha, GL = 1, puro intraindustrial. Un caso hipotético donde X = M exactamente. En la práctica nunca es exactamente 1, pero los autos del Mercosur están cerca: X = 80, M = 60, GL = 0,86. Hay mucho comercio de ida y vuelta."</w:t>
+      </w:r>
+    </w:p>
+    <w:p>
+      <w:pPr>
+        <w:spacing w:before="0" w:after="20"/>
+      </w:pPr>
+      <w:r>
+        <w:rPr>
+          <w:sz w:val="20"/>
+        </w:rPr>
+      </w:r>
+    </w:p>
+    <w:p>
+      <w:pPr>
+        <w:spacing w:before="0" w:after="20"/>
+      </w:pPr>
+      <w:r>
+        <w:rPr>
+          <w:sz w:val="20"/>
+        </w:rPr>
+        <w:t>"Lo que mide el GL es exactamente eso: cuánto solapamiento hay entre lo que exportás y lo que importás en un mismo sector. Solapamiento alto → intraindustrial. Solapamiento bajo → interindustrial."</w:t>
+      </w:r>
+    </w:p>
+    <w:p>
+      <w:pPr>
+        <w:spacing w:before="0" w:after="20"/>
+      </w:pPr>
+      <w:r>
+        <w:rPr>
+          <w:sz w:val="20"/>
+        </w:rPr>
+      </w:r>
+    </w:p>
+    <w:p>
+      <w:pPr>
+        <w:spacing w:before="0" w:after="20"/>
+      </w:pPr>
+      <w:r>
+        <w:rPr>
+          <w:sz w:val="20"/>
+        </w:rPr>
+        <w:t>PREGUNTA RÁPIDA: "Si Argentina exporta 50 de vino e importa 50 de vino, ¿cuánto da el GL?" (Respuesta: GL = 1 — puro IIT. Pero ojo: ¿es el mismo vino? Probablemente no: exporta Malbec premium e importa vino de mesa chileno. Eso es IIT vertical, que vemos en el próximo slide.)</w:t>
+      </w:r>
+    </w:p>
+    <w:p>
+      <w:pPr>
+        <w:spacing w:before="160" w:after="40"/>
+      </w:pPr>
+      <w:r>
+        <w:rPr>
+          <w:b/>
+          <w:sz w:val="20"/>
+        </w:rPr>
+        <w:t xml:space="preserve"> S21  La geometría del GL: la diagonal como referencia</w:t>
+      </w:r>
+    </w:p>
+    <w:p>
+      <w:pPr>
+        <w:spacing w:before="0" w:after="20"/>
+      </w:pPr>
+      <w:r>
+        <w:rPr>
+          <w:sz w:val="20"/>
+        </w:rPr>
+        <w:t>GEOMETRÍA DEL GL — SCATTER (5 minutos)</w:t>
+      </w:r>
+    </w:p>
+    <w:p>
+      <w:pPr>
+        <w:spacing w:before="0" w:after="20"/>
+      </w:pPr>
+      <w:r>
+        <w:rPr>
+          <w:sz w:val="20"/>
+        </w:rPr>
+        <w:t>"Este gráfico muestra la misma idea del espectro pero con más riqueza. En el eje X ponemos las exportaciones de un sector, en el eje Y las importaciones. La diagonal es la línea donde X = M."</w:t>
+      </w:r>
+    </w:p>
+    <w:p>
+      <w:pPr>
+        <w:spacing w:before="0" w:after="20"/>
+      </w:pPr>
+      <w:r>
+        <w:rPr>
+          <w:sz w:val="20"/>
+        </w:rPr>
+      </w:r>
+    </w:p>
+    <w:p>
+      <w:pPr>
+        <w:spacing w:before="0" w:after="20"/>
+      </w:pPr>
+      <w:r>
+        <w:rPr>
+          <w:sz w:val="20"/>
+        </w:rPr>
+        <w:t>"¿Dónde está la soja? Pegada al eje X, lejos de la diagonal. Argentina exporta 100 de soja y no importa nada. Es el caso extremo de comercio interindustrial: todo va en una dirección."</w:t>
+      </w:r>
+    </w:p>
+    <w:p>
+      <w:pPr>
+        <w:spacing w:before="0" w:after="20"/>
+      </w:pPr>
+      <w:r>
+        <w:rPr>
+          <w:sz w:val="20"/>
+        </w:rPr>
+      </w:r>
+    </w:p>
+    <w:p>
+      <w:pPr>
+        <w:spacing w:before="0" w:after="20"/>
+      </w:pPr>
+      <w:r>
+        <w:rPr>
+          <w:sz w:val="20"/>
+        </w:rPr>
+        <w:t>"¿Y los autos del Mercosur? Cerca de la diagonal. Exporta 80, importa 60. El comercio va en las dos direcciones — es intraindustrial."</w:t>
+      </w:r>
+    </w:p>
+    <w:p>
+      <w:pPr>
+        <w:spacing w:before="0" w:after="20"/>
+      </w:pPr>
+      <w:r>
+        <w:rPr>
+          <w:sz w:val="20"/>
+        </w:rPr>
+      </w:r>
+    </w:p>
+    <w:p>
+      <w:pPr>
+        <w:spacing w:before="0" w:after="20"/>
+      </w:pPr>
+      <w:r>
+        <w:rPr>
+          <w:sz w:val="20"/>
+        </w:rPr>
+        <w:t>"La regla geométrica es simple: cuanto más cerca de la diagonal, más intraindustrial. Cuanto más pegado a uno de los ejes, más interindustrial. Y la distancia perpendicular a la diagonal mide exactamente el componente interindustrial."</w:t>
+      </w:r>
+    </w:p>
+    <w:p>
+      <w:pPr>
+        <w:spacing w:before="0" w:after="20"/>
+      </w:pPr>
+      <w:r>
+        <w:rPr>
+          <w:sz w:val="20"/>
+        </w:rPr>
+      </w:r>
+    </w:p>
+    <w:p>
+      <w:pPr>
+        <w:spacing w:before="0" w:after="20"/>
+      </w:pPr>
+      <w:r>
+        <w:rPr>
+          <w:sz w:val="20"/>
+        </w:rPr>
+        <w:t>"¿Y si un sector está arriba de la diagonal? Significa que importa más de lo que exporta. Argentina en electrónica, por ejemplo, estaría arriba de la diagonal y lejos de ella — importador neto, interindustrial."</w:t>
+      </w:r>
+    </w:p>
+    <w:p>
+      <w:pPr>
+        <w:spacing w:before="0" w:after="20"/>
+      </w:pPr>
+      <w:r>
+        <w:rPr>
+          <w:sz w:val="20"/>
+        </w:rPr>
+      </w:r>
+    </w:p>
+    <w:p>
+      <w:pPr>
+        <w:spacing w:before="0" w:after="20"/>
+      </w:pPr>
+      <w:r>
+        <w:rPr>
+          <w:sz w:val="20"/>
+        </w:rPr>
+        <w:t>CONEXIÓN: "Ahora que saben leer el GL y entender su lógica, vamos a ver una distinción importante: no todo el IIT es igual. Hay IIT horizontal (variedades de calidad similar) y vertical (variedades de calidad distinta)."</w:t>
+      </w:r>
+    </w:p>
+    <w:p>
+      <w:pPr>
+        <w:spacing w:before="160" w:after="40"/>
+      </w:pPr>
+      <w:r>
+        <w:rPr>
+          <w:b/>
+          <w:sz w:val="20"/>
+        </w:rPr>
+        <w:t xml:space="preserve"> S22  IIT horizontal vs vertical</w:t>
       </w:r>
     </w:p>
     <w:p>
@@ -3434,7 +3692,7 @@
           <w:b/>
           <w:sz w:val="20"/>
         </w:rPr>
-        <w:t xml:space="preserve"> S21  Evidencia comparada: ¿dónde hay más IIT?</w:t>
+        <w:t xml:space="preserve"> S23  Evidencia comparada: ¿dónde hay más IIT?</w:t>
       </w:r>
     </w:p>
     <w:p>
@@ -3596,7 +3854,7 @@
           <w:b/>
           <w:sz w:val="20"/>
         </w:rPr>
-        <w:t xml:space="preserve"> S22  Caso Mercosur autos: Krugman en acción</w:t>
+        <w:t xml:space="preserve"> S24  Caso Mercosur autos: Krugman en acción</w:t>
       </w:r>
     </w:p>
     <w:p>
@@ -3768,7 +4026,7 @@
           <w:b/>
           <w:sz w:val="20"/>
         </w:rPr>
-        <w:t xml:space="preserve"> S23  Argentina y el comercio intraindustrial: ¿excepción o patrón?</w:t>
+        <w:t xml:space="preserve"> S25  Argentina y el comercio intraindustrial: ¿excepción o patrón?</w:t>
       </w:r>
     </w:p>
     <w:p>
@@ -3942,7 +4200,7 @@
           <w:b/>
           <w:sz w:val="20"/>
         </w:rPr>
-        <w:t xml:space="preserve"> S24  Implicancias  —  Ganadores, perdedores y el tamaño del mercado</w:t>
+        <w:t xml:space="preserve"> S26  Implicancias  —  Ganadores, perdedores y el tamaño del mercado</w:t>
       </w:r>
     </w:p>
     <w:p>
@@ -3976,7 +4234,7 @@
           <w:b/>
           <w:sz w:val="20"/>
         </w:rPr>
-        <w:t xml:space="preserve"> S25  ¿Quién gana y quién pierde?</w:t>
+        <w:t xml:space="preserve"> S27  ¿Quién gana y quién pierde?</w:t>
       </w:r>
     </w:p>
     <w:p>
@@ -4181,7 +4439,7 @@
           <w:b/>
           <w:sz w:val="20"/>
         </w:rPr>
-        <w:t xml:space="preserve"> S26  El efecto home-market y el mercado efectivo</w:t>
+        <w:t xml:space="preserve"> S28  El efecto home-market y el mercado efectivo</w:t>
       </w:r>
     </w:p>
     <w:p>
@@ -4375,7 +4633,7 @@
           <w:b/>
           <w:sz w:val="20"/>
         </w:rPr>
-        <w:t xml:space="preserve"> S27  Nueva Geografía Económica: centro-periferia</w:t>
+        <w:t xml:space="preserve"> S29  Nueva Geografía Económica: centro-periferia</w:t>
       </w:r>
     </w:p>
     <w:p>
@@ -4516,7 +4774,7 @@
           <w:b/>
           <w:sz w:val="20"/>
         </w:rPr>
-        <w:t xml:space="preserve"> S28  Implicancias de política</w:t>
+        <w:t xml:space="preserve"> S30  Implicancias de política</w:t>
       </w:r>
     </w:p>
     <w:p>
@@ -4710,7 +4968,7 @@
           <w:b/>
           <w:sz w:val="20"/>
         </w:rPr>
-        <w:t xml:space="preserve"> S29  ¿Cuándo aplica mejor esta teoría?</w:t>
+        <w:t xml:space="preserve"> S31  ¿Cuándo aplica mejor esta teoría?</w:t>
       </w:r>
     </w:p>
     <w:p>
@@ -4896,7 +5154,7 @@
           <w:b/>
           <w:sz w:val="20"/>
         </w:rPr>
-        <w:t xml:space="preserve"> S30  Nueva Geografía Económica  —  ¿Por qué la producción se concentra en ciertos lugares?</w:t>
+        <w:t xml:space="preserve"> S32  Nueva Geografía Económica  —  ¿Por qué la producción se concentra en ciertos lugares?</w:t>
       </w:r>
     </w:p>
     <w:p>
@@ -4930,7 +5188,7 @@
           <w:b/>
           <w:sz w:val="20"/>
         </w:rPr>
-        <w:t xml:space="preserve"> S31  Fuerzas centrípetas vs centrífugas</w:t>
+        <w:t xml:space="preserve"> S33  Fuerzas centrípetas vs centrífugas</w:t>
       </w:r>
     </w:p>
     <w:p>
@@ -5196,7 +5454,7 @@
           <w:b/>
           <w:sz w:val="20"/>
         </w:rPr>
-        <w:t xml:space="preserve"> S32  El modelo centro-periferia de Krugman (1991)</w:t>
+        <w:t xml:space="preserve"> S34  El modelo centro-periferia de Krugman (1991)</w:t>
       </w:r>
     </w:p>
     <w:p>
@@ -5410,7 +5668,7 @@
           <w:b/>
           <w:sz w:val="20"/>
         </w:rPr>
-        <w:t xml:space="preserve"> S33  Evidencia empírica de la NGE</w:t>
+        <w:t xml:space="preserve"> S35  Evidencia empírica de la NGE</w:t>
       </w:r>
     </w:p>
     <w:p>
@@ -5561,7 +5819,7 @@
           <w:b/>
           <w:sz w:val="20"/>
         </w:rPr>
-        <w:t xml:space="preserve"> S34  NGE y Argentina: la concentración territorial</w:t>
+        <w:t xml:space="preserve"> S36  NGE y Argentina: la concentración territorial</w:t>
       </w:r>
     </w:p>
     <w:p>
@@ -5789,7 +6047,7 @@
           <w:b/>
           <w:sz w:val="20"/>
         </w:rPr>
-        <w:t xml:space="preserve"> S35  Resumen de la clase</w:t>
+        <w:t xml:space="preserve"> S37  Resumen de la clase</w:t>
       </w:r>
     </w:p>
     <w:p>
@@ -5844,7 +6102,7 @@
           <w:b/>
           <w:sz w:val="20"/>
         </w:rPr>
-        <w:t xml:space="preserve"> S36  Material complementario</w:t>
+        <w:t xml:space="preserve"> S38  Material complementario</w:t>
       </w:r>
     </w:p>
     <w:p>
@@ -5943,7 +6201,7 @@
           <w:b/>
           <w:sz w:val="20"/>
         </w:rPr>
-        <w:t xml:space="preserve"> S37  Lecturas</w:t>
+        <w:t xml:space="preserve"> S39  Lecturas</w:t>
       </w:r>
     </w:p>
     <w:p>
@@ -6062,7 +6320,7 @@
           <w:b/>
           <w:sz w:val="20"/>
         </w:rPr>
-        <w:t xml:space="preserve"> S38  Guía de lectura  —  Preguntas orientadoras para la bibliografía</w:t>
+        <w:t xml:space="preserve"> S40  Guía de lectura  —  Preguntas orientadoras para la bibliografía</w:t>
       </w:r>
     </w:p>
     <w:p>
@@ -6096,7 +6354,7 @@
           <w:b/>
           <w:sz w:val="20"/>
         </w:rPr>
-        <w:t xml:space="preserve"> S39  Próxima clase</w:t>
+        <w:t xml:space="preserve"> S41  Próxima clase</w:t>
       </w:r>
     </w:p>
     <w:p>

</xml_diff>

<commit_message>
docs(S4): regenerar notas docente Word con 42 slides actualizados
Incluye slide 20 (niveles de cálculo GL) y slides 21-22 (espectro + scatter).

Co-Authored-By: Claude Opus 4.6 (1M context) <noreply@anthropic.com>
</commit_message>
<xml_diff>
--- a/Clases/sesion04/Notas_Docente_Clase4.docx
+++ b/Clases/sesion04/Notas_Docente_Clase4.docx
@@ -307,7 +307,7 @@
         <w:rPr>
           <w:sz w:val="18"/>
         </w:rPr>
-        <w:t xml:space="preserve">   S20: La intuición del GL: simetría entre X y M</w:t>
+        <w:t xml:space="preserve">   S20: ¿Cómo se calcula el GL en la práctica?</w:t>
       </w:r>
     </w:p>
     <w:p>
@@ -318,7 +318,7 @@
         <w:rPr>
           <w:sz w:val="18"/>
         </w:rPr>
-        <w:t xml:space="preserve">   S21: La geometría del GL: la diagonal como referencia</w:t>
+        <w:t xml:space="preserve">   S21: La intuición del GL: simetría entre X y M</w:t>
       </w:r>
     </w:p>
     <w:p>
@@ -329,7 +329,7 @@
         <w:rPr>
           <w:sz w:val="18"/>
         </w:rPr>
-        <w:t xml:space="preserve">   S22: IIT horizontal vs vertical</w:t>
+        <w:t xml:space="preserve">   S22: La geometría del GL: la diagonal como referencia</w:t>
       </w:r>
     </w:p>
     <w:p>
@@ -340,7 +340,7 @@
         <w:rPr>
           <w:sz w:val="18"/>
         </w:rPr>
-        <w:t xml:space="preserve">   S23: Evidencia comparada: ¿dónde hay más IIT?</w:t>
+        <w:t xml:space="preserve">   S23: IIT horizontal vs vertical</w:t>
       </w:r>
     </w:p>
     <w:p>
@@ -351,7 +351,7 @@
         <w:rPr>
           <w:sz w:val="18"/>
         </w:rPr>
-        <w:t xml:space="preserve">   S24: Caso Mercosur autos: Krugman en acción</w:t>
+        <w:t xml:space="preserve">   S24: Evidencia comparada: ¿dónde hay más IIT?</w:t>
       </w:r>
     </w:p>
     <w:p>
@@ -362,7 +362,18 @@
         <w:rPr>
           <w:sz w:val="18"/>
         </w:rPr>
-        <w:t xml:space="preserve">   S25: Argentina y el comercio intraindustrial: ¿excepción o patrón?</w:t>
+        <w:t xml:space="preserve">   S25: Caso Mercosur autos: Krugman en acción</w:t>
+      </w:r>
+    </w:p>
+    <w:p>
+      <w:pPr>
+        <w:spacing w:before="0" w:after="0"/>
+      </w:pPr>
+      <w:r>
+        <w:rPr>
+          <w:sz w:val="18"/>
+        </w:rPr>
+        <w:t xml:space="preserve">   S26: Argentina y el comercio intraindustrial: ¿excepción o patrón?</w:t>
       </w:r>
     </w:p>
     <w:p>
@@ -385,7 +396,7 @@
         <w:rPr>
           <w:sz w:val="18"/>
         </w:rPr>
-        <w:t xml:space="preserve">   S26: Implicancias — Ganadores, perdedores y el tamaño del mercado</w:t>
+        <w:t xml:space="preserve">   S27: Implicancias — Ganadores, perdedores y el tamaño del mercado</w:t>
       </w:r>
     </w:p>
     <w:p>
@@ -396,7 +407,7 @@
         <w:rPr>
           <w:sz w:val="18"/>
         </w:rPr>
-        <w:t xml:space="preserve">   S27: ¿Quién gana y quién pierde?</w:t>
+        <w:t xml:space="preserve">   S28: ¿Quién gana y quién pierde?</w:t>
       </w:r>
     </w:p>
     <w:p>
@@ -407,7 +418,7 @@
         <w:rPr>
           <w:sz w:val="18"/>
         </w:rPr>
-        <w:t xml:space="preserve">   S28: El efecto home-market y el mercado efectivo</w:t>
+        <w:t xml:space="preserve">   S29: El efecto home-market y el mercado efectivo</w:t>
       </w:r>
     </w:p>
     <w:p>
@@ -418,7 +429,7 @@
         <w:rPr>
           <w:sz w:val="18"/>
         </w:rPr>
-        <w:t xml:space="preserve">   S29: Nueva Geografía Económica: centro-periferia</w:t>
+        <w:t xml:space="preserve">   S30: Nueva Geografía Económica: centro-periferia</w:t>
       </w:r>
     </w:p>
     <w:p>
@@ -429,7 +440,7 @@
         <w:rPr>
           <w:sz w:val="18"/>
         </w:rPr>
-        <w:t xml:space="preserve">   S30: Implicancias de política</w:t>
+        <w:t xml:space="preserve">   S31: Implicancias de política</w:t>
       </w:r>
     </w:p>
     <w:p>
@@ -440,7 +451,7 @@
         <w:rPr>
           <w:sz w:val="18"/>
         </w:rPr>
-        <w:t xml:space="preserve">   S31: ¿Cuándo aplica mejor esta teoría?</w:t>
+        <w:t xml:space="preserve">   S32: ¿Cuándo aplica mejor esta teoría?</w:t>
       </w:r>
     </w:p>
     <w:p>
@@ -463,7 +474,7 @@
         <w:rPr>
           <w:sz w:val="18"/>
         </w:rPr>
-        <w:t xml:space="preserve">   S32: Nueva Geografía Económica — ¿Por qué la producción se concentra en ciertos lugares?</w:t>
+        <w:t xml:space="preserve">   S33: Nueva Geografía Económica — ¿Por qué la producción se concentra en ciertos lugares?</w:t>
       </w:r>
     </w:p>
     <w:p>
@@ -474,7 +485,7 @@
         <w:rPr>
           <w:sz w:val="18"/>
         </w:rPr>
-        <w:t xml:space="preserve">   S33: Fuerzas centrípetas vs centrífugas</w:t>
+        <w:t xml:space="preserve">   S34: Fuerzas centrípetas vs centrífugas</w:t>
       </w:r>
     </w:p>
     <w:p>
@@ -485,7 +496,7 @@
         <w:rPr>
           <w:sz w:val="18"/>
         </w:rPr>
-        <w:t xml:space="preserve">   S34: El modelo centro-periferia de Krugman (1991)</w:t>
+        <w:t xml:space="preserve">   S35: El modelo centro-periferia de Krugman (1991)</w:t>
       </w:r>
     </w:p>
     <w:p>
@@ -496,7 +507,7 @@
         <w:rPr>
           <w:sz w:val="18"/>
         </w:rPr>
-        <w:t xml:space="preserve">   S35: Evidencia empírica de la NGE</w:t>
+        <w:t xml:space="preserve">   S36: Evidencia empírica de la NGE</w:t>
       </w:r>
     </w:p>
     <w:p>
@@ -507,7 +518,7 @@
         <w:rPr>
           <w:sz w:val="18"/>
         </w:rPr>
-        <w:t xml:space="preserve">   S36: NGE y Argentina: la concentración territorial</w:t>
+        <w:t xml:space="preserve">   S37: NGE y Argentina: la concentración territorial</w:t>
       </w:r>
     </w:p>
     <w:p>
@@ -530,7 +541,7 @@
         <w:rPr>
           <w:sz w:val="18"/>
         </w:rPr>
-        <w:t xml:space="preserve">   S37: Resumen de la clase</w:t>
+        <w:t xml:space="preserve">   S38: Resumen de la clase</w:t>
       </w:r>
     </w:p>
     <w:p>
@@ -541,7 +552,7 @@
         <w:rPr>
           <w:sz w:val="18"/>
         </w:rPr>
-        <w:t xml:space="preserve">   S38: Material complementario</w:t>
+        <w:t xml:space="preserve">   S39: Material complementario</w:t>
       </w:r>
     </w:p>
     <w:p>
@@ -552,7 +563,7 @@
         <w:rPr>
           <w:sz w:val="18"/>
         </w:rPr>
-        <w:t xml:space="preserve">   S39: Lecturas</w:t>
+        <w:t xml:space="preserve">   S40: Lecturas</w:t>
       </w:r>
     </w:p>
     <w:p>
@@ -563,7 +574,7 @@
         <w:rPr>
           <w:sz w:val="18"/>
         </w:rPr>
-        <w:t xml:space="preserve">   S40: Guía de lectura — Preguntas orientadoras para la bibliografía</w:t>
+        <w:t xml:space="preserve">   S41: Guía de lectura — Preguntas orientadoras para la bibliografía</w:t>
       </w:r>
     </w:p>
     <w:p>
@@ -574,7 +585,7 @@
         <w:rPr>
           <w:sz w:val="18"/>
         </w:rPr>
-        <w:t xml:space="preserve">   S41: Próxima clase</w:t>
+        <w:t xml:space="preserve">   S42: Próxima clase</w:t>
       </w:r>
     </w:p>
     <w:p>
@@ -3273,7 +3284,306 @@
           <w:b/>
           <w:sz w:val="20"/>
         </w:rPr>
-        <w:t xml:space="preserve"> S20  La intuición del GL: simetría entre X y M</w:t>
+        <w:t xml:space="preserve"> S20  ¿Cómo se calcula el GL en la práctica?</w:t>
+      </w:r>
+    </w:p>
+    <w:p>
+      <w:pPr>
+        <w:spacing w:before="0" w:after="20"/>
+      </w:pPr>
+      <w:r>
+        <w:rPr>
+          <w:sz w:val="20"/>
+        </w:rPr>
+        <w:t>CÓMO SE CALCULA EN LA PRÁCTICA (8 minutos)</w:t>
+      </w:r>
+    </w:p>
+    <w:p>
+      <w:pPr>
+        <w:spacing w:before="0" w:after="20"/>
+      </w:pPr>
+      <w:r>
+        <w:rPr>
+          <w:sz w:val="20"/>
+        </w:rPr>
+        <w:t>"Ya saben la fórmula. Ahora la pregunta práctica: ¿cómo lo aplico si quiero calcular el GL de Argentina? Hay tres niveles."</w:t>
+      </w:r>
+    </w:p>
+    <w:p>
+      <w:pPr>
+        <w:spacing w:before="0" w:after="20"/>
+      </w:pPr>
+      <w:r>
+        <w:rPr>
+          <w:sz w:val="20"/>
+        </w:rPr>
+      </w:r>
+    </w:p>
+    <w:p>
+      <w:pPr>
+        <w:spacing w:before="0" w:after="20"/>
+      </w:pPr>
+      <w:r>
+        <w:rPr>
+          <w:sz w:val="20"/>
+        </w:rPr>
+        <w:t>NIVEL 1 — UN SECTOR, COMERCIO TOTAL:</w:t>
+      </w:r>
+    </w:p>
+    <w:p>
+      <w:pPr>
+        <w:spacing w:before="0" w:after="20"/>
+      </w:pPr>
+      <w:r>
+        <w:rPr>
+          <w:sz w:val="20"/>
+        </w:rPr>
+        <w:t>"El más simple. Tomás un sector — por ejemplo 'vehículos' (capítulo 87 del Sistema Armonizado) — y sumás TODAS las exportaciones e importaciones de Argentina en ese sector, sin importar con quién comercie. ¿Cuánto exporta Argentina en autos al mundo? ¿Cuánto importa? Con eso calculás el GL."</w:t>
+      </w:r>
+    </w:p>
+    <w:p>
+      <w:pPr>
+        <w:spacing w:before="0" w:after="20"/>
+      </w:pPr>
+      <w:r>
+        <w:rPr>
+          <w:sz w:val="20"/>
+        </w:rPr>
+      </w:r>
+    </w:p>
+    <w:p>
+      <w:pPr>
+        <w:spacing w:before="0" w:after="20"/>
+      </w:pPr>
+      <w:r>
+        <w:rPr>
+          <w:sz w:val="20"/>
+        </w:rPr>
+        <w:t>"Ejemplo: Argentina exporta US$ 8.000M en vehículos al mundo e importa US$ 6.000M → GL = 1 - 2.000/14.000 = 0,86."</w:t>
+      </w:r>
+    </w:p>
+    <w:p>
+      <w:pPr>
+        <w:spacing w:before="0" w:after="20"/>
+      </w:pPr>
+      <w:r>
+        <w:rPr>
+          <w:sz w:val="20"/>
+        </w:rPr>
+      </w:r>
+    </w:p>
+    <w:p>
+      <w:pPr>
+        <w:spacing w:before="0" w:after="20"/>
+      </w:pPr>
+      <w:r>
+        <w:rPr>
+          <w:sz w:val="20"/>
+        </w:rPr>
+        <w:t>NIVEL 2 — UN SECTOR, BILATERAL:</w:t>
+      </w:r>
+    </w:p>
+    <w:p>
+      <w:pPr>
+        <w:spacing w:before="0" w:after="20"/>
+      </w:pPr>
+      <w:r>
+        <w:rPr>
+          <w:sz w:val="20"/>
+        </w:rPr>
+        <w:t>"A veces querés saber cuánto IIT hay entre Argentina y Brasil específicamente. Mismo cálculo pero filtrás solo el comercio con Brasil."</w:t>
+      </w:r>
+    </w:p>
+    <w:p>
+      <w:pPr>
+        <w:spacing w:before="0" w:after="20"/>
+      </w:pPr>
+      <w:r>
+        <w:rPr>
+          <w:sz w:val="20"/>
+        </w:rPr>
+      </w:r>
+    </w:p>
+    <w:p>
+      <w:pPr>
+        <w:spacing w:before="0" w:after="20"/>
+      </w:pPr>
+      <w:r>
+        <w:rPr>
+          <w:sz w:val="20"/>
+        </w:rPr>
+        <w:t>"Ejemplo: Argentina exporta US$ 5.000M en autos A BRASIL e importa US$ 4.000M DE BRASIL → GL bilateral = 1 - 1.000/9.000 = 0,89. Es más alto que el global porque el comercio automotriz con Brasil es más simétrico que con el resto del mundo."</w:t>
+      </w:r>
+    </w:p>
+    <w:p>
+      <w:pPr>
+        <w:spacing w:before="0" w:after="20"/>
+      </w:pPr>
+      <w:r>
+        <w:rPr>
+          <w:sz w:val="20"/>
+        </w:rPr>
+      </w:r>
+    </w:p>
+    <w:p>
+      <w:pPr>
+        <w:spacing w:before="0" w:after="20"/>
+      </w:pPr>
+      <w:r>
+        <w:rPr>
+          <w:sz w:val="20"/>
+        </w:rPr>
+        <w:t>NIVEL 3 — GL TOTAL (PROMEDIO PONDERADO):</w:t>
+      </w:r>
+    </w:p>
+    <w:p>
+      <w:pPr>
+        <w:spacing w:before="0" w:after="20"/>
+      </w:pPr>
+      <w:r>
+        <w:rPr>
+          <w:sz w:val="20"/>
+        </w:rPr>
+        <w:t>"Para tener un número resumen — 'el GL del Mercosur es 0,35' o 'el GL de la UE es 0,65' — calculás el GL de CADA sector y después hacés un promedio ponderado. Los sectores con más comercio pesan más."</w:t>
+      </w:r>
+    </w:p>
+    <w:p>
+      <w:pPr>
+        <w:spacing w:before="0" w:after="20"/>
+      </w:pPr>
+      <w:r>
+        <w:rPr>
+          <w:sz w:val="20"/>
+        </w:rPr>
+      </w:r>
+    </w:p>
+    <w:p>
+      <w:pPr>
+        <w:spacing w:before="0" w:after="20"/>
+      </w:pPr>
+      <w:r>
+        <w:rPr>
+          <w:sz w:val="20"/>
+        </w:rPr>
+        <w:t>"La fórmula del promedio ponderado parece complicada pero es intuitiva: el GL de autos (que mueve US$ 14.000M) pesa más que el GL de 'instrumentos musicales' (que mueve US$ 50M)."</w:t>
+      </w:r>
+    </w:p>
+    <w:p>
+      <w:pPr>
+        <w:spacing w:before="0" w:after="20"/>
+      </w:pPr>
+      <w:r>
+        <w:rPr>
+          <w:sz w:val="20"/>
+        </w:rPr>
+      </w:r>
+    </w:p>
+    <w:p>
+      <w:pPr>
+        <w:spacing w:before="0" w:after="20"/>
+      </w:pPr>
+      <w:r>
+        <w:rPr>
+          <w:sz w:val="20"/>
+        </w:rPr>
+        <w:t>EL PROBLEMA DE AGREGACIÓN:</w:t>
+      </w:r>
+    </w:p>
+    <w:p>
+      <w:pPr>
+        <w:spacing w:before="0" w:after="20"/>
+      </w:pPr>
+      <w:r>
+        <w:rPr>
+          <w:sz w:val="20"/>
+        </w:rPr>
+        <w:t>"Y acá viene una trampa importante que Grubel y Lloyd ya advirtieron en 1975. Si definís los sectores de forma gruesa — por ejemplo 'manufacturas' como un solo sector — el GL sale alto porque dentro de 'manufacturas' estás sumando autos, químicos, electrónica, textiles, todo junto. Hay mucha X y mucha M en la misma categoría."</w:t>
+      </w:r>
+    </w:p>
+    <w:p>
+      <w:pPr>
+        <w:spacing w:before="0" w:after="20"/>
+      </w:pPr>
+      <w:r>
+        <w:rPr>
+          <w:sz w:val="20"/>
+        </w:rPr>
+      </w:r>
+    </w:p>
+    <w:p>
+      <w:pPr>
+        <w:spacing w:before="0" w:after="20"/>
+      </w:pPr>
+      <w:r>
+        <w:rPr>
+          <w:sz w:val="20"/>
+        </w:rPr>
+        <w:t>"Pero si desagregás mucho — a 6 dígitos del HS, como 'autopartes de transmisión para vehículos de más de 1500cc' — el GL baja porque es muy probable que Argentina solo exporte o solo importe en esa categoría tan específica."</w:t>
+      </w:r>
+    </w:p>
+    <w:p>
+      <w:pPr>
+        <w:spacing w:before="0" w:after="20"/>
+      </w:pPr>
+      <w:r>
+        <w:rPr>
+          <w:sz w:val="20"/>
+        </w:rPr>
+      </w:r>
+    </w:p>
+    <w:p>
+      <w:pPr>
+        <w:spacing w:before="0" w:after="20"/>
+      </w:pPr>
+      <w:r>
+        <w:rPr>
+          <w:sz w:val="20"/>
+        </w:rPr>
+        <w:t>"Regla práctica: HS 2 dígitos (97 capítulos) o HS 4 dígitos (~1.200 partidas) dan un balance razonable. Es lo que usan la mayoría de los estudios empíricos, incluido Lucángeli (2007) para el Mercosur."</w:t>
+      </w:r>
+    </w:p>
+    <w:p>
+      <w:pPr>
+        <w:spacing w:before="0" w:after="20"/>
+      </w:pPr>
+      <w:r>
+        <w:rPr>
+          <w:sz w:val="20"/>
+        </w:rPr>
+      </w:r>
+    </w:p>
+    <w:p>
+      <w:pPr>
+        <w:spacing w:before="0" w:after="20"/>
+      </w:pPr>
+      <w:r>
+        <w:rPr>
+          <w:sz w:val="20"/>
+        </w:rPr>
+        <w:t>PARA LOS QUE QUIERAN CALCULARLO:</w:t>
+      </w:r>
+    </w:p>
+    <w:p>
+      <w:pPr>
+        <w:spacing w:before="0" w:after="20"/>
+      </w:pPr>
+      <w:r>
+        <w:rPr>
+          <w:sz w:val="20"/>
+        </w:rPr>
+        <w:t>"Si quieren calcular el GL para su trabajo del coloquio — y varios de ustedes van a trabajar con comercio bilateral — los datos están en COMTRADE. Se descargan las X y M por capítulo HS para el par de países que les interese, calculan el GL sector por sector, y después promedian. En el notebook de fuentes de datos que les compartimos tienen el código para conectarse a COMTRADE."</w:t>
+      </w:r>
+    </w:p>
+    <w:p>
+      <w:pPr>
+        <w:spacing w:before="160" w:after="40"/>
+      </w:pPr>
+      <w:r>
+        <w:rPr>
+          <w:b/>
+          <w:sz w:val="20"/>
+        </w:rPr>
+        <w:t xml:space="preserve"> S21  La intuición del GL: simetría entre X y M</w:t>
       </w:r>
     </w:p>
     <w:p>
@@ -3370,7 +3680,7 @@
           <w:b/>
           <w:sz w:val="20"/>
         </w:rPr>
-        <w:t xml:space="preserve"> S21  La geometría del GL: la diagonal como referencia</w:t>
+        <w:t xml:space="preserve"> S22  La geometría del GL: la diagonal como referencia</w:t>
       </w:r>
     </w:p>
     <w:p>
@@ -3509,7 +3819,7 @@
           <w:b/>
           <w:sz w:val="20"/>
         </w:rPr>
-        <w:t xml:space="preserve"> S22  IIT horizontal vs vertical</w:t>
+        <w:t xml:space="preserve"> S23  IIT horizontal vs vertical</w:t>
       </w:r>
     </w:p>
     <w:p>
@@ -3692,7 +4002,7 @@
           <w:b/>
           <w:sz w:val="20"/>
         </w:rPr>
-        <w:t xml:space="preserve"> S23  Evidencia comparada: ¿dónde hay más IIT?</w:t>
+        <w:t xml:space="preserve"> S24  Evidencia comparada: ¿dónde hay más IIT?</w:t>
       </w:r>
     </w:p>
     <w:p>
@@ -3854,7 +4164,7 @@
           <w:b/>
           <w:sz w:val="20"/>
         </w:rPr>
-        <w:t xml:space="preserve"> S24  Caso Mercosur autos: Krugman en acción</w:t>
+        <w:t xml:space="preserve"> S25  Caso Mercosur autos: Krugman en acción</w:t>
       </w:r>
     </w:p>
     <w:p>
@@ -4026,7 +4336,7 @@
           <w:b/>
           <w:sz w:val="20"/>
         </w:rPr>
-        <w:t xml:space="preserve"> S25  Argentina y el comercio intraindustrial: ¿excepción o patrón?</w:t>
+        <w:t xml:space="preserve"> S26  Argentina y el comercio intraindustrial: ¿excepción o patrón?</w:t>
       </w:r>
     </w:p>
     <w:p>
@@ -4200,7 +4510,7 @@
           <w:b/>
           <w:sz w:val="20"/>
         </w:rPr>
-        <w:t xml:space="preserve"> S26  Implicancias  —  Ganadores, perdedores y el tamaño del mercado</w:t>
+        <w:t xml:space="preserve"> S27  Implicancias  —  Ganadores, perdedores y el tamaño del mercado</w:t>
       </w:r>
     </w:p>
     <w:p>
@@ -4234,7 +4544,7 @@
           <w:b/>
           <w:sz w:val="20"/>
         </w:rPr>
-        <w:t xml:space="preserve"> S27  ¿Quién gana y quién pierde?</w:t>
+        <w:t xml:space="preserve"> S28  ¿Quién gana y quién pierde?</w:t>
       </w:r>
     </w:p>
     <w:p>
@@ -4439,7 +4749,7 @@
           <w:b/>
           <w:sz w:val="20"/>
         </w:rPr>
-        <w:t xml:space="preserve"> S28  El efecto home-market y el mercado efectivo</w:t>
+        <w:t xml:space="preserve"> S29  El efecto home-market y el mercado efectivo</w:t>
       </w:r>
     </w:p>
     <w:p>
@@ -4633,7 +4943,7 @@
           <w:b/>
           <w:sz w:val="20"/>
         </w:rPr>
-        <w:t xml:space="preserve"> S29  Nueva Geografía Económica: centro-periferia</w:t>
+        <w:t xml:space="preserve"> S30  Nueva Geografía Económica: centro-periferia</w:t>
       </w:r>
     </w:p>
     <w:p>
@@ -4774,7 +5084,7 @@
           <w:b/>
           <w:sz w:val="20"/>
         </w:rPr>
-        <w:t xml:space="preserve"> S30  Implicancias de política</w:t>
+        <w:t xml:space="preserve"> S31  Implicancias de política</w:t>
       </w:r>
     </w:p>
     <w:p>
@@ -4968,7 +5278,7 @@
           <w:b/>
           <w:sz w:val="20"/>
         </w:rPr>
-        <w:t xml:space="preserve"> S31  ¿Cuándo aplica mejor esta teoría?</w:t>
+        <w:t xml:space="preserve"> S32  ¿Cuándo aplica mejor esta teoría?</w:t>
       </w:r>
     </w:p>
     <w:p>
@@ -5154,7 +5464,7 @@
           <w:b/>
           <w:sz w:val="20"/>
         </w:rPr>
-        <w:t xml:space="preserve"> S32  Nueva Geografía Económica  —  ¿Por qué la producción se concentra en ciertos lugares?</w:t>
+        <w:t xml:space="preserve"> S33  Nueva Geografía Económica  —  ¿Por qué la producción se concentra en ciertos lugares?</w:t>
       </w:r>
     </w:p>
     <w:p>
@@ -5188,7 +5498,7 @@
           <w:b/>
           <w:sz w:val="20"/>
         </w:rPr>
-        <w:t xml:space="preserve"> S33  Fuerzas centrípetas vs centrífugas</w:t>
+        <w:t xml:space="preserve"> S34  Fuerzas centrípetas vs centrífugas</w:t>
       </w:r>
     </w:p>
     <w:p>
@@ -5454,7 +5764,7 @@
           <w:b/>
           <w:sz w:val="20"/>
         </w:rPr>
-        <w:t xml:space="preserve"> S34  El modelo centro-periferia de Krugman (1991)</w:t>
+        <w:t xml:space="preserve"> S35  El modelo centro-periferia de Krugman (1991)</w:t>
       </w:r>
     </w:p>
     <w:p>
@@ -5668,7 +5978,7 @@
           <w:b/>
           <w:sz w:val="20"/>
         </w:rPr>
-        <w:t xml:space="preserve"> S35  Evidencia empírica de la NGE</w:t>
+        <w:t xml:space="preserve"> S36  Evidencia empírica de la NGE</w:t>
       </w:r>
     </w:p>
     <w:p>
@@ -5819,7 +6129,7 @@
           <w:b/>
           <w:sz w:val="20"/>
         </w:rPr>
-        <w:t xml:space="preserve"> S36  NGE y Argentina: la concentración territorial</w:t>
+        <w:t xml:space="preserve"> S37  NGE y Argentina: la concentración territorial</w:t>
       </w:r>
     </w:p>
     <w:p>
@@ -6047,7 +6357,7 @@
           <w:b/>
           <w:sz w:val="20"/>
         </w:rPr>
-        <w:t xml:space="preserve"> S37  Resumen de la clase</w:t>
+        <w:t xml:space="preserve"> S38  Resumen de la clase</w:t>
       </w:r>
     </w:p>
     <w:p>
@@ -6102,7 +6412,7 @@
           <w:b/>
           <w:sz w:val="20"/>
         </w:rPr>
-        <w:t xml:space="preserve"> S38  Material complementario</w:t>
+        <w:t xml:space="preserve"> S39  Material complementario</w:t>
       </w:r>
     </w:p>
     <w:p>
@@ -6201,7 +6511,7 @@
           <w:b/>
           <w:sz w:val="20"/>
         </w:rPr>
-        <w:t xml:space="preserve"> S39  Lecturas</w:t>
+        <w:t xml:space="preserve"> S40  Lecturas</w:t>
       </w:r>
     </w:p>
     <w:p>
@@ -6320,7 +6630,7 @@
           <w:b/>
           <w:sz w:val="20"/>
         </w:rPr>
-        <w:t xml:space="preserve"> S40  Guía de lectura  —  Preguntas orientadoras para la bibliografía</w:t>
+        <w:t xml:space="preserve"> S41  Guía de lectura  —  Preguntas orientadoras para la bibliografía</w:t>
       </w:r>
     </w:p>
     <w:p>
@@ -6354,7 +6664,7 @@
           <w:b/>
           <w:sz w:val="20"/>
         </w:rPr>
-        <w:t xml:space="preserve"> S41  Próxima clase</w:t>
+        <w:t xml:space="preserve"> S42  Próxima clase</w:t>
       </w:r>
     </w:p>
     <w:p>

</xml_diff>